<commit_message>
hydro and salmon quarto code updates
</commit_message>
<xml_diff>
--- a/delta_hydro.docx
+++ b/delta_hydro.docx
@@ -2,7 +2,7 @@
 <file path=word/document.xml><?xml version="1.0" encoding="utf-8"?>
 <w:document xmlns:w="http://schemas.openxmlformats.org/wordprocessingml/2006/main" xmlns:m="http://schemas.openxmlformats.org/officeDocument/2006/math" xmlns:r="http://schemas.openxmlformats.org/officeDocument/2006/relationships" xmlns:o="urn:schemas-microsoft-com:office:office" xmlns:v="urn:schemas-microsoft-com:vml" xmlns:w10="urn:schemas-microsoft-com:office:word" xmlns:a="http://schemas.openxmlformats.org/drawingml/2006/main" xmlns:pic="http://schemas.openxmlformats.org/drawingml/2006/picture" xmlns:wp="http://schemas.openxmlformats.org/drawingml/2006/wordprocessingDrawing">
   <w:body>
-    <w:bookmarkStart w:id="31" w:name="Xf95f5b70571ba8021d6ee24a1278b8507812738"/>
+    <w:bookmarkStart w:id="34" w:name="Xf95f5b70571ba8021d6ee24a1278b8507812738"/>
     <w:p>
       <w:pPr>
         <w:pStyle w:val="Heading2"/>
@@ -26,7 +26,7 @@
           <w:i/>
           <w:iCs/>
         </w:rPr>
-        <w:t xml:space="preserve">December 03, 2025</w:t>
+        <w:t xml:space="preserve">December 23, 2025</w:t>
       </w:r>
     </w:p>
     <w:bookmarkStart w:id="20" w:name="operational-and-regulatory-conditions"/>
@@ -61,7 +61,7 @@
         <w:pStyle w:val="FirstParagraph"/>
       </w:pPr>
       <w:r>
-        <w:t xml:space="preserve">Most recent inflow at Freeport in the Sacramento River and Vernalis in the San Joaquin River is 11,010 and 883 cfs respectively. Most recent 1-day, 5-day, and 14-day OMRI measurements were -5,355, -5,790, and -7,182 respectively, and most recent export data were 1,782 for Jones Pumping Plant and 4,046 for Henry O. Banks Pumping Plant.</w:t>
+        <w:t xml:space="preserve">Most recent inflow at Freeport in the Sacramento River and Vernalis in the San Joaquin River is 32,753 and 5,784 cfs respectively. Most recent 1-day, 5-day, and 14-day OMRI measurements were -6,428, -5,551, and -3,587 respectively, and most recent export data were 3,531 for Jones Pumping Plant and 5,562 for Henry O. Banks Pumping Plant.</w:t>
       </w:r>
     </w:p>
     <w:tbl>
@@ -194,7 +194,7 @@
                 <w:p>
                   <w:pPr>
                     <w:pStyle w:val="Compact"/>
-                    <w:jc w:val="right"/>
+                    <w:jc w:val="left"/>
                     <w:jc w:val="center"/>
                   </w:pPr>
                   <w:r>
@@ -207,7 +207,7 @@
                 <w:p>
                   <w:pPr>
                     <w:pStyle w:val="Compact"/>
-                    <w:jc w:val="left"/>
+                    <w:jc w:val="right"/>
                     <w:jc w:val="center"/>
                   </w:pPr>
                   <w:r>
@@ -220,7 +220,7 @@
                 <w:p>
                   <w:pPr>
                     <w:pStyle w:val="Compact"/>
-                    <w:jc w:val="left"/>
+                    <w:jc w:val="right"/>
                     <w:jc w:val="center"/>
                   </w:pPr>
                   <w:r>
@@ -233,7 +233,7 @@
                 <w:p>
                   <w:pPr>
                     <w:pStyle w:val="Compact"/>
-                    <w:jc w:val="left"/>
+                    <w:jc w:val="right"/>
                     <w:jc w:val="center"/>
                   </w:pPr>
                   <w:r>
@@ -246,7 +246,7 @@
                 <w:p>
                   <w:pPr>
                     <w:pStyle w:val="Compact"/>
-                    <w:jc w:val="left"/>
+                    <w:jc w:val="right"/>
                     <w:jc w:val="center"/>
                   </w:pPr>
                   <w:r>
@@ -259,7 +259,7 @@
                 <w:p>
                   <w:pPr>
                     <w:pStyle w:val="Compact"/>
-                    <w:jc w:val="left"/>
+                    <w:jc w:val="right"/>
                     <w:jc w:val="center"/>
                   </w:pPr>
                   <w:r>
@@ -274,7 +274,7 @@
                 <w:p>
                   <w:pPr>
                     <w:pStyle w:val="Compact"/>
-                    <w:jc w:val="right"/>
+                    <w:jc w:val="left"/>
                     <w:jc w:val="center"/>
                   </w:pPr>
                   <w:r>
@@ -287,7 +287,7 @@
                 <w:p>
                   <w:pPr>
                     <w:pStyle w:val="Compact"/>
-                    <w:jc w:val="left"/>
+                    <w:jc w:val="right"/>
                     <w:jc w:val="center"/>
                   </w:pPr>
                   <w:r>
@@ -300,7 +300,7 @@
                 <w:p>
                   <w:pPr>
                     <w:pStyle w:val="Compact"/>
-                    <w:jc w:val="left"/>
+                    <w:jc w:val="right"/>
                     <w:jc w:val="center"/>
                   </w:pPr>
                   <w:r>
@@ -313,7 +313,7 @@
                 <w:p>
                   <w:pPr>
                     <w:pStyle w:val="Compact"/>
-                    <w:jc w:val="left"/>
+                    <w:jc w:val="right"/>
                     <w:jc w:val="center"/>
                   </w:pPr>
                   <w:r>
@@ -326,7 +326,7 @@
                 <w:p>
                   <w:pPr>
                     <w:pStyle w:val="Compact"/>
-                    <w:jc w:val="left"/>
+                    <w:jc w:val="right"/>
                     <w:jc w:val="center"/>
                   </w:pPr>
                   <w:r>
@@ -339,7 +339,7 @@
                 <w:p>
                   <w:pPr>
                     <w:pStyle w:val="Compact"/>
-                    <w:jc w:val="left"/>
+                    <w:jc w:val="right"/>
                     <w:jc w:val="center"/>
                   </w:pPr>
                   <w:r>
@@ -355,7 +355,7 @@
       </w:tr>
     </w:tbl>
     <w:bookmarkEnd w:id="26"/>
-    <w:bookmarkStart w:id="30" w:name="zone-of-influence"/>
+    <w:bookmarkStart w:id="33" w:name="zone-of-influence"/>
     <w:p>
       <w:pPr>
         <w:pStyle w:val="Heading3"/>
@@ -369,7 +369,7 @@
         <w:pStyle w:val="FirstParagraph"/>
       </w:pPr>
       <w:r>
-        <w:t xml:space="preserve">The Zone of Influence (ZOI) analysis served as a Line of Evidence for comparing alternative actions in the Long Term Operations EIS. This analysis evaluated the spatial extent of hydrologic alteration resulting from pumping under varying Old and Middle River flow conditions and Sacramento-San Joaquin river inflow conditions. This analysis was adapted for the assessment by focusing on a single alternative, Alt2woTUCPDeltaVa, which served as the proposed action in the LTO, and binned maps into 1 of 9 categories based on low, medium, and high inflows from the Sacramento and San Joaquin flow. In general, changes in channel length across OMR levels may correlate with entrainment risk, where larger increases in channel length from more positive to more negative OMR represent greater entrainment risk.</w:t>
+        <w:t xml:space="preserve">The Zone of Influence (ZOI) analysis served as a Line of Evidence for comparing alternative actions in the Long Term Operations EIS. This analysis evaluated the spatial extent of hydrologic alteration resulting from pumping under varying Old and Middle River flow conditions and Sacramento-San Joaquin river inflow conditions. This analysis was adapted for the assessment by focusing on a single alternative, Alt2woTUCPDeltaVa, which served as the proposed action in the 2024 Record of Decision, and binned maps into 1 of 9 categories based on low, medium, and high inflows from the Sacramento and San Joaquin flow. In general, changes in channel length across OMR levels may correlate with entrainment risk, where larger increases in channel length from more positive to more negative OMR represent greater entrainment risk.</w:t>
       </w:r>
     </w:p>
     <w:p>
@@ -377,90 +377,190 @@
         <w:pStyle w:val="BodyText"/>
       </w:pPr>
       <w:r>
-        <w:t xml:space="preserve">Current conditions at Freeport and Vernalis indicate that delta hydrology falls within the</w:t>
+        <w:t xml:space="preserve">Current conditions were queried from most recent Freeport flow data on the Sacramento River and Vernalis flow data on the San Joaquin river from</w:t>
       </w:r>
       <w:r>
         <w:t xml:space="preserve"> </w:t>
       </w:r>
-      <w:r>
-        <w:t xml:space="preserve">‘lolo’</w:t>
+      <w:hyperlink r:id="rId27">
+        <w:r>
+          <w:rPr>
+            <w:rStyle w:val="Hyperlink"/>
+          </w:rPr>
+          <w:t xml:space="preserve">SacPAS</w:t>
+        </w:r>
+      </w:hyperlink>
+      <w:r>
+        <w:t xml:space="preserve">. Forecasted flows were queried from short range deterministic flows provided by the</w:t>
       </w:r>
       <w:r>
         <w:t xml:space="preserve"> </w:t>
       </w:r>
-      <w:r>
-        <w:t xml:space="preserve">category (see appendix for hydrology bin definitions). The altered channel length for the</w:t>
-      </w:r>
-      <w:r>
-        <w:t xml:space="preserve"> </w:t>
-      </w:r>
-      <w:r>
-        <w:t xml:space="preserve">‘lolo’</w:t>
-      </w:r>
-      <w:r>
-        <w:t xml:space="preserve"> </w:t>
-      </w:r>
-      <w:r>
-        <w:t xml:space="preserve">hydrology is 16 kilometers (km) for an OMR of -2000 and 163 km for an OMR of &lt;-5500. Change in altered channel length between OMR levels is 147 km, which represents 20.6% of change in altered channel length among the nine hydrology bins</w:t>
+      <w:hyperlink r:id="rId28">
+        <w:r>
+          <w:rPr>
+            <w:rStyle w:val="Hyperlink"/>
+          </w:rPr>
+          <w:t xml:space="preserve">California Nevada River Forecast Center</w:t>
+        </w:r>
+      </w:hyperlink>
+      <w:r>
+        <w:t xml:space="preserve">.</w:t>
       </w:r>
     </w:p>
     <w:p>
       <w:pPr>
-        <w:pStyle w:val="CaptionedFigure"/>
-      </w:pPr>
-      <w:r>
-        <w:drawing>
-          <wp:inline>
-            <wp:extent cx="5334000" cy="5334000"/>
-            <wp:effectExtent b="0" l="0" r="0" t="0"/>
-            <wp:docPr descr="Modeled Zone of Influence at different OMRI scenarios based on current inflow hydrology from the Sacramento River and San Joaquin River" title="" id="28" name="Picture"/>
-            <a:graphic>
-              <a:graphicData uri="http://schemas.openxmlformats.org/drawingml/2006/picture">
-                <pic:pic>
-                  <pic:nvPicPr>
-                    <pic:cNvPr descr="delta_hydro_files/figure-docx/zoi_graph-1.png" id="29" name="Picture"/>
-                    <pic:cNvPicPr>
-                      <a:picLocks noChangeArrowheads="1" noChangeAspect="1"/>
-                    </pic:cNvPicPr>
-                  </pic:nvPicPr>
-                  <pic:blipFill>
-                    <a:blip r:embed="rId27"/>
-                    <a:stretch>
-                      <a:fillRect/>
-                    </a:stretch>
-                  </pic:blipFill>
-                  <pic:spPr bwMode="auto">
-                    <a:xfrm>
-                      <a:off x="0" y="0"/>
-                      <a:ext cx="5334000" cy="5334000"/>
-                    </a:xfrm>
-                    <a:prstGeom prst="rect">
-                      <a:avLst/>
-                    </a:prstGeom>
-                    <a:noFill/>
-                    <a:ln w="9525">
-                      <a:noFill/>
-                      <a:headEnd/>
-                      <a:tailEnd/>
-                    </a:ln>
-                  </pic:spPr>
-                </pic:pic>
-              </a:graphicData>
-            </a:graphic>
-          </wp:inline>
-        </w:drawing>
+        <w:pStyle w:val="BodyText"/>
+      </w:pPr>
+      <w:r>
+        <w:t xml:space="preserve">Current conditions at Freeport and Vernalis indicate that delta hydrology falls within the</w:t>
+      </w:r>
+      <w:r>
+        <w:t xml:space="preserve"> </w:t>
+      </w:r>
+      <w:r>
+        <w:t xml:space="preserve">‘hihi’</w:t>
+      </w:r>
+      <w:r>
+        <w:t xml:space="preserve"> </w:t>
+      </w:r>
+      <w:r>
+        <w:t xml:space="preserve">category. Forecasted conditions averaged across the next 7 days falls within the</w:t>
+      </w:r>
+      <w:r>
+        <w:t xml:space="preserve"> </w:t>
+      </w:r>
+      <w:r>
+        <w:t xml:space="preserve">‘hihi’</w:t>
+      </w:r>
+      <w:r>
+        <w:t xml:space="preserve"> </w:t>
+      </w:r>
+      <w:r>
+        <w:t xml:space="preserve">category.</w:t>
       </w:r>
     </w:p>
     <w:p>
       <w:pPr>
-        <w:pStyle w:val="ImageCaption"/>
-      </w:pPr>
-      <w:r>
-        <w:t xml:space="preserve">Modeled Zone of Influence at different OMRI scenarios based on current inflow hydrology from the Sacramento River and San Joaquin River</w:t>
+        <w:pStyle w:val="BodyText"/>
+      </w:pPr>
+      <w:r>
+        <w:t xml:space="preserve">The altered channel length for the current</w:t>
+      </w:r>
+      <w:r>
+        <w:t xml:space="preserve"> </w:t>
+      </w:r>
+      <w:r>
+        <w:t xml:space="preserve">“hihi”</w:t>
+      </w:r>
+      <w:r>
+        <w:t xml:space="preserve"> </w:t>
+      </w:r>
+      <w:r>
+        <w:t xml:space="preserve">hydrology is 99 kilometers (km) for an OMR of -2000 and 114 km for an OMR of &lt;-5500. The altered channel length for forecasted</w:t>
+      </w:r>
+      <w:r>
+        <w:t xml:space="preserve"> </w:t>
+      </w:r>
+      <w:r>
+        <w:t xml:space="preserve">“hihi”</w:t>
+      </w:r>
+      <w:r>
+        <w:t xml:space="preserve"> </w:t>
+      </w:r>
+      <w:r>
+        <w:t xml:space="preserve">hydrology is 99 kilometers (km) for an OMR of -2000 and 114 km for an OMR of &lt;-5500.</w:t>
       </w:r>
     </w:p>
-    <w:bookmarkEnd w:id="30"/>
-    <w:bookmarkEnd w:id="31"/>
+    <w:p>
+      <w:pPr>
+        <w:pStyle w:val="BodyText"/>
+      </w:pPr>
+      <w:r>
+        <w:t xml:space="preserve">Change in altered channel length between OMR levels is 15 km for current conditions and 15 km for forecasted conditions indicating that ZOI impacts across OMR scenarios would decrease under forecasted hydrology.</w:t>
+      </w:r>
+    </w:p>
+    <w:tbl>
+      <w:tblPr>
+        <w:tblStyle w:val="Table"/>
+        <w:tblW w:type="pct" w:w="5000"/>
+        <w:tblLayout w:type="fixed"/>
+        <w:tblLook w:firstRow="0" w:lastRow="0" w:firstColumn="0" w:lastColumn="0" w:noHBand="0" w:noVBand="0" w:val="0000"/>
+      </w:tblPr>
+      <w:tblGrid>
+        <w:gridCol w:w="7920"/>
+      </w:tblGrid>
+      <w:tr>
+        <w:tc>
+          <w:tcPr/>
+          <w:bookmarkStart w:id="32" w:name="fig-zoi_graph"/>
+          <w:p>
+            <w:pPr>
+              <w:pStyle w:val="Compact"/>
+              <w:jc w:val="center"/>
+            </w:pPr>
+            <w:r>
+              <w:drawing>
+                <wp:inline>
+                  <wp:extent cx="5334000" cy="2667000"/>
+                  <wp:effectExtent b="0" l="0" r="0" t="0"/>
+                  <wp:docPr descr="" title="" id="30" name="Picture"/>
+                  <a:graphic>
+                    <a:graphicData uri="http://schemas.openxmlformats.org/drawingml/2006/picture">
+                      <pic:pic>
+                        <pic:nvPicPr>
+                          <pic:cNvPr descr="delta_hydro_files/figure-docx/fig-zoi_graph-1.png" id="31" name="Picture"/>
+                          <pic:cNvPicPr>
+                            <a:picLocks noChangeArrowheads="1" noChangeAspect="1"/>
+                          </pic:cNvPicPr>
+                        </pic:nvPicPr>
+                        <pic:blipFill>
+                          <a:blip r:embed="rId29"/>
+                          <a:stretch>
+                            <a:fillRect/>
+                          </a:stretch>
+                        </pic:blipFill>
+                        <pic:spPr bwMode="auto">
+                          <a:xfrm>
+                            <a:off x="0" y="0"/>
+                            <a:ext cx="5334000" cy="2667000"/>
+                          </a:xfrm>
+                          <a:prstGeom prst="rect">
+                            <a:avLst/>
+                          </a:prstGeom>
+                          <a:noFill/>
+                          <a:ln w="9525">
+                            <a:noFill/>
+                            <a:headEnd/>
+                            <a:tailEnd/>
+                          </a:ln>
+                        </pic:spPr>
+                      </pic:pic>
+                    </a:graphicData>
+                  </a:graphic>
+                </wp:inline>
+              </w:drawing>
+            </w:r>
+          </w:p>
+          <w:p>
+            <w:pPr>
+              <w:jc w:val="center"/>
+            </w:pPr>
+            <w:pPr>
+              <w:jc w:val="start"/>
+              <w:spacing w:before="200"/>
+              <w:pStyle w:val="ImageCaption"/>
+            </w:pPr>
+            <w:r>
+              <w:t xml:space="preserve">Figure 2: Modeled Zone of Influence at different OMRI scenarios based on current inflow hydrology (left) and forecasted inflow hydrology (right) from the Sacramento River and San Joaquin River</w:t>
+            </w:r>
+          </w:p>
+          <w:bookmarkEnd w:id="32"/>
+        </w:tc>
+      </w:tr>
+    </w:tbl>
+    <w:bookmarkEnd w:id="33"/>
+    <w:bookmarkEnd w:id="34"/>
     <w:sectPr>
       <w:footnotePr>
         <w:numRestart w:val="eachSect"/>

</xml_diff>

<commit_message>
salmon code updates and hydro code fix
</commit_message>
<xml_diff>
--- a/delta_hydro.docx
+++ b/delta_hydro.docx
@@ -26,7 +26,7 @@
           <w:i/>
           <w:iCs/>
         </w:rPr>
-        <w:t xml:space="preserve">December 23, 2025</w:t>
+        <w:t xml:space="preserve">December 29, 2025</w:t>
       </w:r>
     </w:p>
     <w:bookmarkStart w:id="20" w:name="operational-and-regulatory-conditions"/>
@@ -43,7 +43,7 @@
         <w:pStyle w:val="FirstParagraph"/>
       </w:pPr>
       <w:r>
-        <w:t xml:space="preserve">DCC gates are the current controlling factor. See most recent weekly outlook for more information.</w:t>
+        <w:t xml:space="preserve">Entrainment management is the current controlling factor. See most recent weekly outlook for more information.</w:t>
       </w:r>
     </w:p>
     <w:bookmarkEnd w:id="20"/>
@@ -61,7 +61,7 @@
         <w:pStyle w:val="FirstParagraph"/>
       </w:pPr>
       <w:r>
-        <w:t xml:space="preserve">Most recent inflow at Freeport in the Sacramento River and Vernalis in the San Joaquin River is 32,753 and 5,784 cfs respectively. Most recent 1-day, 5-day, and 14-day OMRI measurements were -6,428, -5,551, and -3,587 respectively, and most recent export data were 3,531 for Jones Pumping Plant and 5,562 for Henry O. Banks Pumping Plant.</w:t>
+        <w:t xml:space="preserve">Most recent inflow at Freeport in the Sacramento River and Vernalis in the San Joaquin River is 69,589 and 3,541 cfs respectively. Most recent 1-day, 5-day, and 14-day OMRI measurements were -5,006, -4,542, and -4,712 respectively, and most recent export data were 3,527 for Jones Pumping Plant and 3,464 for Henry O. Banks Pumping Plant.</w:t>
       </w:r>
     </w:p>
     <w:tbl>
@@ -178,12 +178,12 @@
               <w:tblLook w:firstRow="1" w:lastRow="0" w:firstColumn="0" w:lastColumn="0" w:noHBand="0" w:noVBand="0" w:val="0020"/>
             </w:tblPr>
             <w:tblGrid>
-              <w:gridCol w:w="528"/>
-              <w:gridCol w:w="1496"/>
+              <w:gridCol w:w="465"/>
               <w:gridCol w:w="1320"/>
-              <w:gridCol w:w="1496"/>
-              <w:gridCol w:w="2112"/>
-              <w:gridCol w:w="968"/>
+              <w:gridCol w:w="1164"/>
+              <w:gridCol w:w="1320"/>
+              <w:gridCol w:w="1863"/>
+              <w:gridCol w:w="1785"/>
             </w:tblGrid>
             <w:tr>
               <w:trPr>
@@ -348,6 +348,86 @@
                 </w:p>
               </w:tc>
             </w:tr>
+            <w:tr>
+              <w:tc>
+                <w:tcPr/>
+                <w:p>
+                  <w:pPr>
+                    <w:pStyle w:val="Compact"/>
+                    <w:jc w:val="left"/>
+                    <w:jc w:val="center"/>
+                  </w:pPr>
+                  <w:r>
+                    <w:t xml:space="preserve">2</w:t>
+                  </w:r>
+                </w:p>
+              </w:tc>
+              <w:tc>
+                <w:tcPr/>
+                <w:p>
+                  <w:pPr>
+                    <w:pStyle w:val="Compact"/>
+                    <w:jc w:val="right"/>
+                    <w:jc w:val="center"/>
+                  </w:pPr>
+                  <w:r>
+                    <w:t xml:space="preserve">First Flush</w:t>
+                  </w:r>
+                </w:p>
+              </w:tc>
+              <w:tc>
+                <w:tcPr/>
+                <w:p>
+                  <w:pPr>
+                    <w:pStyle w:val="Compact"/>
+                    <w:jc w:val="right"/>
+                    <w:jc w:val="center"/>
+                  </w:pPr>
+                  <w:r>
+                    <w:t xml:space="preserve">12/24/2025</w:t>
+                  </w:r>
+                </w:p>
+              </w:tc>
+              <w:tc>
+                <w:tcPr/>
+                <w:p>
+                  <w:pPr>
+                    <w:pStyle w:val="Compact"/>
+                    <w:jc w:val="right"/>
+                    <w:jc w:val="center"/>
+                  </w:pPr>
+                  <w:r>
+                    <w:t xml:space="preserve">12/25/2025</w:t>
+                  </w:r>
+                </w:p>
+              </w:tc>
+              <w:tc>
+                <w:tcPr/>
+                <w:p>
+                  <w:pPr>
+                    <w:pStyle w:val="Compact"/>
+                    <w:jc w:val="right"/>
+                    <w:jc w:val="center"/>
+                  </w:pPr>
+                  <w:r>
+                    <w:t xml:space="preserve">Ongoing</w:t>
+                  </w:r>
+                </w:p>
+              </w:tc>
+              <w:tc>
+                <w:tcPr/>
+                <w:p>
+                  <w:pPr>
+                    <w:pStyle w:val="Compact"/>
+                    <w:jc w:val="right"/>
+                    <w:jc w:val="center"/>
+                  </w:pPr>
+                  <w:r>
+                    <w:t xml:space="preserve">Entrainment Management</w:t>
+                  </w:r>
+                </w:p>
+              </w:tc>
+            </w:tr>
           </w:tbl>
           <w:bookmarkEnd w:id="25"/>
           <w:p/>
@@ -419,7 +499,7 @@
         <w:t xml:space="preserve"> </w:t>
       </w:r>
       <w:r>
-        <w:t xml:space="preserve">‘hihi’</w:t>
+        <w:t xml:space="preserve">‘himed’</w:t>
       </w:r>
       <w:r>
         <w:t xml:space="preserve"> </w:t>
@@ -431,7 +511,7 @@
         <w:t xml:space="preserve"> </w:t>
       </w:r>
       <w:r>
-        <w:t xml:space="preserve">‘hihi’</w:t>
+        <w:t xml:space="preserve">‘himed’</w:t>
       </w:r>
       <w:r>
         <w:t xml:space="preserve"> </w:t>
@@ -451,25 +531,25 @@
         <w:t xml:space="preserve"> </w:t>
       </w:r>
       <w:r>
-        <w:t xml:space="preserve">“hihi”</w:t>
+        <w:t xml:space="preserve">“himed”</w:t>
       </w:r>
       <w:r>
         <w:t xml:space="preserve"> </w:t>
       </w:r>
       <w:r>
-        <w:t xml:space="preserve">hydrology is 99 kilometers (km) for an OMR of -2000 and 114 km for an OMR of &lt;-5500. The altered channel length for forecasted</w:t>
+        <w:t xml:space="preserve">hydrology is 23, 53, 118 and 111 kilometers (km) across OMR bins of -2000, -3500, -5000 and &lt;-5500 respectively. The altered channel length for forecasted</w:t>
       </w:r>
       <w:r>
         <w:t xml:space="preserve"> </w:t>
       </w:r>
       <w:r>
-        <w:t xml:space="preserve">“hihi”</w:t>
+        <w:t xml:space="preserve">“himed”</w:t>
       </w:r>
       <w:r>
         <w:t xml:space="preserve"> </w:t>
       </w:r>
       <w:r>
-        <w:t xml:space="preserve">hydrology is 99 kilometers (km) for an OMR of -2000 and 114 km for an OMR of &lt;-5500.</w:t>
+        <w:t xml:space="preserve">hydrology is 23, 53, 118 and 111 kilometeres (km) across OMR bins of -2000, -3500, -5000 and &lt;-5500 respectively.</w:t>
       </w:r>
     </w:p>
     <w:p>
@@ -477,7 +557,7 @@
         <w:pStyle w:val="BodyText"/>
       </w:pPr>
       <w:r>
-        <w:t xml:space="preserve">Change in altered channel length between OMR levels is 15 km for current conditions and 15 km for forecasted conditions indicating that ZOI impacts across OMR scenarios would decrease under forecasted hydrology.</w:t>
+        <w:t xml:space="preserve">Change in altered channel length between OMR levels is 88 km for current conditions and 88 km for forecasted conditions indicating that ZOI impacts across OMR scenarios would not change between current and forecasted conditions. Across the nine hydrology bins, changes in altered channel length across OMR scenarios are moderate (between 25th and 75th percentiles) for both current and forecasted hydrology.</w:t>
       </w:r>
     </w:p>
     <w:tbl>

</xml_diff>

<commit_message>
docx template same across three qmd scripts
</commit_message>
<xml_diff>
--- a/delta_hydro.docx
+++ b/delta_hydro.docx
@@ -2,13 +2,13 @@
 <file path=word/document.xml><?xml version="1.0" encoding="utf-8"?>
 <w:document xmlns:w="http://schemas.openxmlformats.org/wordprocessingml/2006/main" xmlns:m="http://schemas.openxmlformats.org/officeDocument/2006/math" xmlns:r="http://schemas.openxmlformats.org/officeDocument/2006/relationships" xmlns:o="urn:schemas-microsoft-com:office:office" xmlns:v="urn:schemas-microsoft-com:vml" xmlns:w10="urn:schemas-microsoft-com:office:word" xmlns:a="http://schemas.openxmlformats.org/drawingml/2006/main" xmlns:pic="http://schemas.openxmlformats.org/drawingml/2006/picture" xmlns:wp="http://schemas.openxmlformats.org/drawingml/2006/wordprocessingDrawing">
   <w:body>
-    <w:bookmarkStart w:id="34" w:name="Xf95f5b70571ba8021d6ee24a1278b8507812738"/>
+    <w:bookmarkStart w:id="34" w:name="current-delta-hydrologic-conditions"/>
     <w:p>
       <w:pPr>
         <w:pStyle w:val="Heading2"/>
       </w:pPr>
       <w:r>
-        <w:t xml:space="preserve">PRELIMINARY DATA: Current Delta Hydrologic Conditions</w:t>
+        <w:t xml:space="preserve">Current Delta Hydrologic Conditions</w:t>
       </w:r>
     </w:p>
     <w:p>
@@ -26,7 +26,7 @@
           <w:i/>
           <w:iCs/>
         </w:rPr>
-        <w:t xml:space="preserve">January 06, 2026</w:t>
+        <w:t xml:space="preserve">January 29, 2026</w:t>
       </w:r>
     </w:p>
     <w:bookmarkStart w:id="20" w:name="operational-and-regulatory-conditions"/>
@@ -61,7 +61,7 @@
         <w:pStyle w:val="FirstParagraph"/>
       </w:pPr>
       <w:r>
-        <w:t xml:space="preserve">Most recent inflow at Freeport in the Sacramento River and Vernalis in the San Joaquin River is 66,749 and 2,566 cfs respectively. Most recent 1-day, 5-day, and 14-day OMRI measurements were -4,905, -4,197, and -5,061 respectively, and most recent export data were 3,551 for Jones Pumping Plant and 1,734 for Henry O. Banks Pumping Plant.</w:t>
+        <w:t xml:space="preserve">Most recent inflow at Freeport in the Sacramento River and Vernalis in the San Joaquin River is 25,094 and 1,996 cfs respectively. Most recent 1-day, 5-day, and 14-day OMRI measurements were -4,945, -4,894, and -5,061 respectively, and most recent export data were 3,551 for Jones Pumping Plant and 1,734 for Henry O. Banks Pumping Plant.</w:t>
       </w:r>
     </w:p>
     <w:tbl>
@@ -86,7 +86,7 @@
             <w:r>
               <w:drawing>
                 <wp:inline>
-                  <wp:extent cx="5334000" cy="4148666"/>
+                  <wp:extent cx="5943600" cy="4622800"/>
                   <wp:effectExtent b="0" l="0" r="0" t="0"/>
                   <wp:docPr descr="" title="" id="22" name="Picture"/>
                   <a:graphic>
@@ -107,7 +107,7 @@
                         <pic:spPr bwMode="auto">
                           <a:xfrm>
                             <a:off x="0" y="0"/>
-                            <a:ext cx="5334000" cy="4148666"/>
+                            <a:ext cx="5943600" cy="4622800"/>
                           </a:xfrm>
                           <a:prstGeom prst="rect">
                             <a:avLst/>
@@ -136,7 +136,7 @@
               <w:pStyle w:val="ImageCaption"/>
             </w:pPr>
             <w:r>
-              <w:t xml:space="preserve">Figure 1: Operations and Action Summary, WY 2026. The colors in the OMRI plot indicate different types of triggers (see Table 1). OMRI data calculated by SacPAS, Freeport (FPT) and Vernalis (VNS) flow data from CDEC, and CVP (TRP) and SWP (HRO) exports data from CDEC.</w:t>
+              <w:t xml:space="preserve">Figure 1: Operations and Action Summary, WY 2026. The numbers and dashed lines in the OMRI plot indicate different triggers (see Table 1), with shading representing specific action periods. OMRI data (colored lines) calculated by SacPAS, Freeport (FPT) and Vernalis (VNS) flow data from CDEC, and CVP (TRP) and SWP (HRO) exports data from CDEC.</w:t>
             </w:r>
           </w:p>
           <w:bookmarkEnd w:id="24"/>
@@ -170,259 +170,1006 @@
               <w:t xml:space="preserve">Table 1: Summary of Actions and Triggers, WY 2026</w:t>
             </w:r>
           </w:p>
-          <w:tbl>
+          <w:tbl xmlns:w="http://schemas.openxmlformats.org/wordprocessingml/2006/main" xmlns:r="http://schemas.openxmlformats.org/officeDocument/2006/relationships" xmlns:w14="http://schemas.microsoft.com/office/word/2010/wordml" xmlns:wp="http://schemas.openxmlformats.org/drawingml/2006/wordprocessingDrawing" xmlns:a="http://schemas.openxmlformats.org/drawingml/2006/main" xmlns:pic="http://schemas.openxmlformats.org/drawingml/2006/picture">
             <w:tblPr>
-              <w:tblStyle w:val="Table"/>
-              <w:tblW w:type="pct" w:w="5000"/>
               <w:tblLayout w:type="fixed"/>
-              <w:tblLook w:firstRow="1" w:lastRow="0" w:firstColumn="0" w:lastColumn="0" w:noHBand="0" w:noVBand="0" w:val="0020"/>
+              <w:jc w:val="center"/>
+              <w:tblLook w:firstRow="1" w:lastRow="0" w:firstColumn="0" w:lastColumn="0" w:noHBand="0" w:noVBand="1"/>
             </w:tblPr>
             <w:tblGrid>
-              <w:gridCol w:w="465"/>
-              <w:gridCol w:w="1320"/>
-              <w:gridCol w:w="1164"/>
-              <w:gridCol w:w="1320"/>
-              <w:gridCol w:w="1863"/>
-              <w:gridCol w:w="1785"/>
+              <w:gridCol w:w="1080"/>
+              <w:gridCol w:w="1080"/>
+              <w:gridCol w:w="1080"/>
+              <w:gridCol w:w="1080"/>
+              <w:gridCol w:w="1080"/>
+              <w:gridCol w:w="1080"/>
             </w:tblGrid>
             <w:tr>
               <w:trPr>
-                <w:tblHeader w:val="on"/>
+                <w:trHeight w:val="360" w:hRule="auto"/>
+                <w:tblHeader/>
               </w:trPr>
+              header1
               <w:tc>
-                <w:tcPr/>
+                <w:tcPr>
+                  <w:tcBorders>
+                    <w:bottom w:val="single" w:sz="12" w:space="0" w:color="666666"/>
+                    <w:top w:val="single" w:sz="12" w:space="0" w:color="666666"/>
+                    <w:left w:val="none" w:sz="0" w:space="0" w:color="000000"/>
+                    <w:right w:val="none" w:sz="0" w:space="0" w:color="000000"/>
+                  </w:tcBorders>
+                  <w:shd w:val="clear" w:color="auto" w:fill="FFFFFF"/>
+                  <w:tcMar>
+                    <w:top w:w="0" w:type="dxa"/>
+                    <w:bottom w:w="0" w:type="dxa"/>
+                    <w:left w:w="0" w:type="dxa"/>
+                    <w:right w:w="0" w:type="dxa"/>
+                  </w:tcMar>
+                  <w:vAlign w:val="center"/>
+                </w:tcPr>
                 <w:p>
                   <w:pPr>
-                    <w:pStyle w:val="Compact"/>
-                    <w:jc w:val="left"/>
-                    <w:jc w:val="center"/>
+                    <w:jc w:val="right"/>
+                    <w:pBdr>
+                      <w:bottom w:val="none" w:sz="0" w:space="0" w:color="000000"/>
+                      <w:top w:val="none" w:sz="0" w:space="0" w:color="000000"/>
+                      <w:left w:val="none" w:sz="0" w:space="0" w:color="000000"/>
+                      <w:right w:val="none" w:sz="0" w:space="0" w:color="000000"/>
+                    </w:pBdr>
+                    <w:spacing w:after="100" w:before="100" w:line="240"/>
+                    <w:ind w:left="100" w:right="100" w:firstLine="0" w:firstLineChars="0"/>
+                    <w:rPr>
+                      <w:rFonts w:ascii="Carlito" w:hAnsi="Carlito" w:eastAsia="Carlito" w:cs="Carlito"/>
+                      <w:i w:val="false"/>
+                      <w:b w:val="false"/>
+                      <w:u w:val="none"/>
+                      <w:strike w:val="false"/>
+                      <w:sz w:val="22"/>
+                      <w:szCs w:val="22"/>
+                      <w:color w:val="000000"/>
+                    </w:rPr>
                   </w:pPr>
-                  <w:r>
+                  <w:r xmlns:w="http://schemas.openxmlformats.org/wordprocessingml/2006/main" xmlns:wp="http://schemas.openxmlformats.org/drawingml/2006/wordprocessingDrawing" xmlns:r="http://schemas.openxmlformats.org/officeDocument/2006/relationships" xmlns:w14="http://schemas.microsoft.com/office/word/2010/wordml">
+                    <w:rPr>
+                      <w:rFonts w:ascii="Carlito" w:hAnsi="Carlito" w:eastAsia="Carlito" w:cs="Carlito"/>
+                      <w:i w:val="false"/>
+                      <w:b w:val="false"/>
+                      <w:u w:val="none"/>
+                      <w:strike w:val="false"/>
+                      <w:sz w:val="22"/>
+                      <w:szCs w:val="22"/>
+                      <w:color w:val="000000"/>
+                    </w:rPr>
                     <w:t xml:space="preserve">Label</w:t>
                   </w:r>
                 </w:p>
               </w:tc>
               <w:tc>
-                <w:tcPr/>
+                <w:tcPr>
+                  <w:tcBorders>
+                    <w:bottom w:val="single" w:sz="12" w:space="0" w:color="666666"/>
+                    <w:top w:val="single" w:sz="12" w:space="0" w:color="666666"/>
+                    <w:left w:val="none" w:sz="0" w:space="0" w:color="000000"/>
+                    <w:right w:val="none" w:sz="0" w:space="0" w:color="000000"/>
+                  </w:tcBorders>
+                  <w:shd w:val="clear" w:color="auto" w:fill="FFFFFF"/>
+                  <w:tcMar>
+                    <w:top w:w="0" w:type="dxa"/>
+                    <w:bottom w:w="0" w:type="dxa"/>
+                    <w:left w:w="0" w:type="dxa"/>
+                    <w:right w:w="0" w:type="dxa"/>
+                  </w:tcMar>
+                  <w:vAlign w:val="center"/>
+                </w:tcPr>
                 <w:p>
                   <w:pPr>
-                    <w:pStyle w:val="Compact"/>
-                    <w:jc w:val="right"/>
-                    <w:jc w:val="center"/>
+                    <w:jc w:val="left"/>
+                    <w:pBdr>
+                      <w:bottom w:val="none" w:sz="0" w:space="0" w:color="000000"/>
+                      <w:top w:val="none" w:sz="0" w:space="0" w:color="000000"/>
+                      <w:left w:val="none" w:sz="0" w:space="0" w:color="000000"/>
+                      <w:right w:val="none" w:sz="0" w:space="0" w:color="000000"/>
+                    </w:pBdr>
+                    <w:spacing w:after="100" w:before="100" w:line="240"/>
+                    <w:ind w:left="100" w:right="100" w:firstLine="0" w:firstLineChars="0"/>
+                    <w:rPr>
+                      <w:rFonts w:ascii="Carlito" w:hAnsi="Carlito" w:eastAsia="Carlito" w:cs="Carlito"/>
+                      <w:i w:val="false"/>
+                      <w:b w:val="false"/>
+                      <w:u w:val="none"/>
+                      <w:strike w:val="false"/>
+                      <w:sz w:val="22"/>
+                      <w:szCs w:val="22"/>
+                      <w:color w:val="000000"/>
+                    </w:rPr>
                   </w:pPr>
-                  <w:r>
+                  <w:r xmlns:w="http://schemas.openxmlformats.org/wordprocessingml/2006/main" xmlns:wp="http://schemas.openxmlformats.org/drawingml/2006/wordprocessingDrawing" xmlns:r="http://schemas.openxmlformats.org/officeDocument/2006/relationships" xmlns:w14="http://schemas.microsoft.com/office/word/2010/wordml">
+                    <w:rPr>
+                      <w:rFonts w:ascii="Carlito" w:hAnsi="Carlito" w:eastAsia="Carlito" w:cs="Carlito"/>
+                      <w:i w:val="false"/>
+                      <w:b w:val="false"/>
+                      <w:u w:val="none"/>
+                      <w:strike w:val="false"/>
+                      <w:sz w:val="22"/>
+                      <w:szCs w:val="22"/>
+                      <w:color w:val="000000"/>
+                    </w:rPr>
                     <w:t xml:space="preserve">Action</w:t>
                   </w:r>
                 </w:p>
               </w:tc>
               <w:tc>
-                <w:tcPr/>
+                <w:tcPr>
+                  <w:tcBorders>
+                    <w:bottom w:val="single" w:sz="12" w:space="0" w:color="666666"/>
+                    <w:top w:val="single" w:sz="12" w:space="0" w:color="666666"/>
+                    <w:left w:val="none" w:sz="0" w:space="0" w:color="000000"/>
+                    <w:right w:val="none" w:sz="0" w:space="0" w:color="000000"/>
+                  </w:tcBorders>
+                  <w:shd w:val="clear" w:color="auto" w:fill="FFFFFF"/>
+                  <w:tcMar>
+                    <w:top w:w="0" w:type="dxa"/>
+                    <w:bottom w:w="0" w:type="dxa"/>
+                    <w:left w:w="0" w:type="dxa"/>
+                    <w:right w:w="0" w:type="dxa"/>
+                  </w:tcMar>
+                  <w:vAlign w:val="center"/>
+                </w:tcPr>
                 <w:p>
                   <w:pPr>
-                    <w:pStyle w:val="Compact"/>
-                    <w:jc w:val="right"/>
-                    <w:jc w:val="center"/>
+                    <w:jc w:val="left"/>
+                    <w:pBdr>
+                      <w:bottom w:val="none" w:sz="0" w:space="0" w:color="000000"/>
+                      <w:top w:val="none" w:sz="0" w:space="0" w:color="000000"/>
+                      <w:left w:val="none" w:sz="0" w:space="0" w:color="000000"/>
+                      <w:right w:val="none" w:sz="0" w:space="0" w:color="000000"/>
+                    </w:pBdr>
+                    <w:spacing w:after="100" w:before="100" w:line="240"/>
+                    <w:ind w:left="100" w:right="100" w:firstLine="0" w:firstLineChars="0"/>
+                    <w:rPr>
+                      <w:rFonts w:ascii="Carlito" w:hAnsi="Carlito" w:eastAsia="Carlito" w:cs="Carlito"/>
+                      <w:i w:val="false"/>
+                      <w:b w:val="false"/>
+                      <w:u w:val="none"/>
+                      <w:strike w:val="false"/>
+                      <w:sz w:val="22"/>
+                      <w:szCs w:val="22"/>
+                      <w:color w:val="000000"/>
+                    </w:rPr>
                   </w:pPr>
-                  <w:r>
+                  <w:r xmlns:w="http://schemas.openxmlformats.org/wordprocessingml/2006/main" xmlns:wp="http://schemas.openxmlformats.org/drawingml/2006/wordprocessingDrawing" xmlns:r="http://schemas.openxmlformats.org/officeDocument/2006/relationships" xmlns:w14="http://schemas.microsoft.com/office/word/2010/wordml">
+                    <w:rPr>
+                      <w:rFonts w:ascii="Carlito" w:hAnsi="Carlito" w:eastAsia="Carlito" w:cs="Carlito"/>
+                      <w:i w:val="false"/>
+                      <w:b w:val="false"/>
+                      <w:u w:val="none"/>
+                      <w:strike w:val="false"/>
+                      <w:sz w:val="22"/>
+                      <w:szCs w:val="22"/>
+                      <w:color w:val="000000"/>
+                    </w:rPr>
                     <w:t xml:space="preserve">Date Triggered</w:t>
                   </w:r>
                 </w:p>
               </w:tc>
               <w:tc>
-                <w:tcPr/>
+                <w:tcPr>
+                  <w:tcBorders>
+                    <w:bottom w:val="single" w:sz="12" w:space="0" w:color="666666"/>
+                    <w:top w:val="single" w:sz="12" w:space="0" w:color="666666"/>
+                    <w:left w:val="none" w:sz="0" w:space="0" w:color="000000"/>
+                    <w:right w:val="none" w:sz="0" w:space="0" w:color="000000"/>
+                  </w:tcBorders>
+                  <w:shd w:val="clear" w:color="auto" w:fill="FFFFFF"/>
+                  <w:tcMar>
+                    <w:top w:w="0" w:type="dxa"/>
+                    <w:bottom w:w="0" w:type="dxa"/>
+                    <w:left w:w="0" w:type="dxa"/>
+                    <w:right w:w="0" w:type="dxa"/>
+                  </w:tcMar>
+                  <w:vAlign w:val="center"/>
+                </w:tcPr>
                 <w:p>
                   <w:pPr>
-                    <w:pStyle w:val="Compact"/>
                     <w:jc w:val="right"/>
-                    <w:jc w:val="center"/>
+                    <w:pBdr>
+                      <w:bottom w:val="none" w:sz="0" w:space="0" w:color="000000"/>
+                      <w:top w:val="none" w:sz="0" w:space="0" w:color="000000"/>
+                      <w:left w:val="none" w:sz="0" w:space="0" w:color="000000"/>
+                      <w:right w:val="none" w:sz="0" w:space="0" w:color="000000"/>
+                    </w:pBdr>
+                    <w:spacing w:after="100" w:before="100" w:line="240"/>
+                    <w:ind w:left="100" w:right="100" w:firstLine="0" w:firstLineChars="0"/>
+                    <w:rPr>
+                      <w:rFonts w:ascii="Carlito" w:hAnsi="Carlito" w:eastAsia="Carlito" w:cs="Carlito"/>
+                      <w:i w:val="false"/>
+                      <w:b w:val="false"/>
+                      <w:u w:val="none"/>
+                      <w:strike w:val="false"/>
+                      <w:sz w:val="22"/>
+                      <w:szCs w:val="22"/>
+                      <w:color w:val="000000"/>
+                    </w:rPr>
                   </w:pPr>
-                  <w:r>
+                  <w:r xmlns:w="http://schemas.openxmlformats.org/wordprocessingml/2006/main" xmlns:wp="http://schemas.openxmlformats.org/drawingml/2006/wordprocessingDrawing" xmlns:r="http://schemas.openxmlformats.org/officeDocument/2006/relationships" xmlns:w14="http://schemas.microsoft.com/office/word/2010/wordml">
+                    <w:rPr>
+                      <w:rFonts w:ascii="Carlito" w:hAnsi="Carlito" w:eastAsia="Carlito" w:cs="Carlito"/>
+                      <w:i w:val="false"/>
+                      <w:b w:val="false"/>
+                      <w:u w:val="none"/>
+                      <w:strike w:val="false"/>
+                      <w:sz w:val="22"/>
+                      <w:szCs w:val="22"/>
+                      <w:color w:val="000000"/>
+                    </w:rPr>
                     <w:t xml:space="preserve">Date Implemented</w:t>
                   </w:r>
                 </w:p>
               </w:tc>
               <w:tc>
-                <w:tcPr/>
+                <w:tcPr>
+                  <w:tcBorders>
+                    <w:bottom w:val="single" w:sz="12" w:space="0" w:color="666666"/>
+                    <w:top w:val="single" w:sz="12" w:space="0" w:color="666666"/>
+                    <w:left w:val="none" w:sz="0" w:space="0" w:color="000000"/>
+                    <w:right w:val="none" w:sz="0" w:space="0" w:color="000000"/>
+                  </w:tcBorders>
+                  <w:shd w:val="clear" w:color="auto" w:fill="FFFFFF"/>
+                  <w:tcMar>
+                    <w:top w:w="0" w:type="dxa"/>
+                    <w:bottom w:w="0" w:type="dxa"/>
+                    <w:left w:w="0" w:type="dxa"/>
+                    <w:right w:w="0" w:type="dxa"/>
+                  </w:tcMar>
+                  <w:vAlign w:val="center"/>
+                </w:tcPr>
                 <w:p>
                   <w:pPr>
-                    <w:pStyle w:val="Compact"/>
-                    <w:jc w:val="right"/>
-                    <w:jc w:val="center"/>
+                    <w:jc w:val="left"/>
+                    <w:pBdr>
+                      <w:bottom w:val="none" w:sz="0" w:space="0" w:color="000000"/>
+                      <w:top w:val="none" w:sz="0" w:space="0" w:color="000000"/>
+                      <w:left w:val="none" w:sz="0" w:space="0" w:color="000000"/>
+                      <w:right w:val="none" w:sz="0" w:space="0" w:color="000000"/>
+                    </w:pBdr>
+                    <w:spacing w:after="100" w:before="100" w:line="240"/>
+                    <w:ind w:left="100" w:right="100" w:firstLine="0" w:firstLineChars="0"/>
+                    <w:rPr>
+                      <w:rFonts w:ascii="Carlito" w:hAnsi="Carlito" w:eastAsia="Carlito" w:cs="Carlito"/>
+                      <w:i w:val="false"/>
+                      <w:b w:val="false"/>
+                      <w:u w:val="none"/>
+                      <w:strike w:val="false"/>
+                      <w:sz w:val="22"/>
+                      <w:szCs w:val="22"/>
+                      <w:color w:val="000000"/>
+                    </w:rPr>
                   </w:pPr>
-                  <w:r>
+                  <w:r xmlns:w="http://schemas.openxmlformats.org/wordprocessingml/2006/main" xmlns:wp="http://schemas.openxmlformats.org/drawingml/2006/wordprocessingDrawing" xmlns:r="http://schemas.openxmlformats.org/officeDocument/2006/relationships" xmlns:w14="http://schemas.microsoft.com/office/word/2010/wordml">
+                    <w:rPr>
+                      <w:rFonts w:ascii="Carlito" w:hAnsi="Carlito" w:eastAsia="Carlito" w:cs="Carlito"/>
+                      <w:i w:val="false"/>
+                      <w:b w:val="false"/>
+                      <w:u w:val="none"/>
+                      <w:strike w:val="false"/>
+                      <w:sz w:val="22"/>
+                      <w:szCs w:val="22"/>
+                      <w:color w:val="000000"/>
+                    </w:rPr>
                     <w:t xml:space="preserve">Number Days Implemented</w:t>
                   </w:r>
                 </w:p>
               </w:tc>
               <w:tc>
-                <w:tcPr/>
+                <w:tcPr>
+                  <w:tcBorders>
+                    <w:bottom w:val="single" w:sz="12" w:space="0" w:color="666666"/>
+                    <w:top w:val="single" w:sz="12" w:space="0" w:color="666666"/>
+                    <w:left w:val="none" w:sz="0" w:space="0" w:color="000000"/>
+                    <w:right w:val="none" w:sz="0" w:space="0" w:color="000000"/>
+                  </w:tcBorders>
+                  <w:shd w:val="clear" w:color="auto" w:fill="FFFFFF"/>
+                  <w:tcMar>
+                    <w:top w:w="0" w:type="dxa"/>
+                    <w:bottom w:w="0" w:type="dxa"/>
+                    <w:left w:w="0" w:type="dxa"/>
+                    <w:right w:w="0" w:type="dxa"/>
+                  </w:tcMar>
+                  <w:vAlign w:val="center"/>
+                </w:tcPr>
                 <w:p>
                   <w:pPr>
-                    <w:pStyle w:val="Compact"/>
-                    <w:jc w:val="right"/>
-                    <w:jc w:val="center"/>
+                    <w:jc w:val="left"/>
+                    <w:pBdr>
+                      <w:bottom w:val="none" w:sz="0" w:space="0" w:color="000000"/>
+                      <w:top w:val="none" w:sz="0" w:space="0" w:color="000000"/>
+                      <w:left w:val="none" w:sz="0" w:space="0" w:color="000000"/>
+                      <w:right w:val="none" w:sz="0" w:space="0" w:color="000000"/>
+                    </w:pBdr>
+                    <w:spacing w:after="100" w:before="100" w:line="240"/>
+                    <w:ind w:left="100" w:right="100" w:firstLine="0" w:firstLineChars="0"/>
+                    <w:rPr>
+                      <w:rFonts w:ascii="Carlito" w:hAnsi="Carlito" w:eastAsia="Carlito" w:cs="Carlito"/>
+                      <w:i w:val="false"/>
+                      <w:b w:val="false"/>
+                      <w:u w:val="none"/>
+                      <w:strike w:val="false"/>
+                      <w:sz w:val="22"/>
+                      <w:szCs w:val="22"/>
+                      <w:color w:val="000000"/>
+                    </w:rPr>
                   </w:pPr>
-                  <w:r>
+                  <w:r xmlns:w="http://schemas.openxmlformats.org/wordprocessingml/2006/main" xmlns:wp="http://schemas.openxmlformats.org/drawingml/2006/wordprocessingDrawing" xmlns:r="http://schemas.openxmlformats.org/officeDocument/2006/relationships" xmlns:w14="http://schemas.microsoft.com/office/word/2010/wordml">
+                    <w:rPr>
+                      <w:rFonts w:ascii="Carlito" w:hAnsi="Carlito" w:eastAsia="Carlito" w:cs="Carlito"/>
+                      <w:i w:val="false"/>
+                      <w:b w:val="false"/>
+                      <w:u w:val="none"/>
+                      <w:strike w:val="false"/>
+                      <w:sz w:val="22"/>
+                      <w:szCs w:val="22"/>
+                      <w:color w:val="000000"/>
+                    </w:rPr>
                     <w:t xml:space="preserve">Regulation</w:t>
                   </w:r>
                 </w:p>
               </w:tc>
             </w:tr>
             <w:tr>
+              <w:trPr>
+                <w:trHeight w:val="360" w:hRule="auto"/>
+              </w:trPr>
+              body1
               <w:tc>
-                <w:tcPr/>
+                <w:tcPr>
+                  <w:tcBorders>
+                    <w:bottom w:val="none" w:sz="0" w:space="0" w:color="000000"/>
+                    <w:top w:val="single" w:sz="12" w:space="0" w:color="666666"/>
+                    <w:left w:val="none" w:sz="0" w:space="0" w:color="000000"/>
+                    <w:right w:val="none" w:sz="0" w:space="0" w:color="000000"/>
+                  </w:tcBorders>
+                  <w:shd w:val="clear" w:color="auto" w:fill="FFFFFF"/>
+                  <w:tcMar>
+                    <w:top w:w="0" w:type="dxa"/>
+                    <w:bottom w:w="0" w:type="dxa"/>
+                    <w:left w:w="0" w:type="dxa"/>
+                    <w:right w:w="0" w:type="dxa"/>
+                  </w:tcMar>
+                  <w:vAlign w:val="center"/>
+                </w:tcPr>
                 <w:p>
                   <w:pPr>
-                    <w:pStyle w:val="Compact"/>
-                    <w:jc w:val="left"/>
-                    <w:jc w:val="center"/>
+                    <w:jc w:val="right"/>
+                    <w:pBdr>
+                      <w:bottom w:val="none" w:sz="0" w:space="0" w:color="000000"/>
+                      <w:top w:val="none" w:sz="0" w:space="0" w:color="000000"/>
+                      <w:left w:val="none" w:sz="0" w:space="0" w:color="000000"/>
+                      <w:right w:val="none" w:sz="0" w:space="0" w:color="000000"/>
+                    </w:pBdr>
+                    <w:spacing w:after="100" w:before="100" w:line="240"/>
+                    <w:ind w:left="100" w:right="100" w:firstLine="0" w:firstLineChars="0"/>
+                    <w:rPr>
+                      <w:rFonts w:ascii="Carlito" w:hAnsi="Carlito" w:eastAsia="Carlito" w:cs="Carlito"/>
+                      <w:i w:val="false"/>
+                      <w:b w:val="false"/>
+                      <w:u w:val="none"/>
+                      <w:strike w:val="false"/>
+                      <w:sz w:val="22"/>
+                      <w:szCs w:val="22"/>
+                      <w:color w:val="000000"/>
+                    </w:rPr>
                   </w:pPr>
-                  <w:r>
+                  <w:r xmlns:w="http://schemas.openxmlformats.org/wordprocessingml/2006/main" xmlns:wp="http://schemas.openxmlformats.org/drawingml/2006/wordprocessingDrawing" xmlns:r="http://schemas.openxmlformats.org/officeDocument/2006/relationships" xmlns:w14="http://schemas.microsoft.com/office/word/2010/wordml">
+                    <w:rPr>
+                      <w:rFonts w:ascii="Carlito" w:hAnsi="Carlito" w:eastAsia="Carlito" w:cs="Carlito"/>
+                      <w:i w:val="false"/>
+                      <w:b w:val="false"/>
+                      <w:u w:val="none"/>
+                      <w:strike w:val="false"/>
+                      <w:sz w:val="22"/>
+                      <w:szCs w:val="22"/>
+                      <w:color w:val="000000"/>
+                    </w:rPr>
                     <w:t xml:space="preserve">1</w:t>
                   </w:r>
                 </w:p>
               </w:tc>
               <w:tc>
-                <w:tcPr/>
+                <w:tcPr>
+                  <w:tcBorders>
+                    <w:bottom w:val="none" w:sz="0" w:space="0" w:color="000000"/>
+                    <w:top w:val="single" w:sz="12" w:space="0" w:color="666666"/>
+                    <w:left w:val="none" w:sz="0" w:space="0" w:color="000000"/>
+                    <w:right w:val="none" w:sz="0" w:space="0" w:color="000000"/>
+                  </w:tcBorders>
+                  <w:shd w:val="clear" w:color="auto" w:fill="FFFFFF"/>
+                  <w:tcMar>
+                    <w:top w:w="0" w:type="dxa"/>
+                    <w:bottom w:w="0" w:type="dxa"/>
+                    <w:left w:w="0" w:type="dxa"/>
+                    <w:right w:w="0" w:type="dxa"/>
+                  </w:tcMar>
+                  <w:vAlign w:val="center"/>
+                </w:tcPr>
                 <w:p>
                   <w:pPr>
-                    <w:pStyle w:val="Compact"/>
-                    <w:jc w:val="right"/>
-                    <w:jc w:val="center"/>
+                    <w:jc w:val="left"/>
+                    <w:pBdr>
+                      <w:bottom w:val="none" w:sz="0" w:space="0" w:color="000000"/>
+                      <w:top w:val="none" w:sz="0" w:space="0" w:color="000000"/>
+                      <w:left w:val="none" w:sz="0" w:space="0" w:color="000000"/>
+                      <w:right w:val="none" w:sz="0" w:space="0" w:color="000000"/>
+                    </w:pBdr>
+                    <w:spacing w:after="100" w:before="100" w:line="240"/>
+                    <w:ind w:left="100" w:right="100" w:firstLine="0" w:firstLineChars="0"/>
+                    <w:rPr>
+                      <w:rFonts w:ascii="Carlito" w:hAnsi="Carlito" w:eastAsia="Carlito" w:cs="Carlito"/>
+                      <w:i w:val="false"/>
+                      <w:b w:val="false"/>
+                      <w:u w:val="none"/>
+                      <w:strike w:val="false"/>
+                      <w:sz w:val="22"/>
+                      <w:szCs w:val="22"/>
+                      <w:color w:val="000000"/>
+                    </w:rPr>
                   </w:pPr>
-                  <w:r>
+                  <w:r xmlns:w="http://schemas.openxmlformats.org/wordprocessingml/2006/main" xmlns:wp="http://schemas.openxmlformats.org/drawingml/2006/wordprocessingDrawing" xmlns:r="http://schemas.openxmlformats.org/officeDocument/2006/relationships" xmlns:w14="http://schemas.microsoft.com/office/word/2010/wordml">
+                    <w:rPr>
+                      <w:rFonts w:ascii="Carlito" w:hAnsi="Carlito" w:eastAsia="Carlito" w:cs="Carlito"/>
+                      <w:i w:val="false"/>
+                      <w:b w:val="false"/>
+                      <w:u w:val="none"/>
+                      <w:strike w:val="false"/>
+                      <w:sz w:val="22"/>
+                      <w:szCs w:val="22"/>
+                      <w:color w:val="000000"/>
+                    </w:rPr>
                     <w:t xml:space="preserve">DCC Gate Closure</w:t>
                   </w:r>
                 </w:p>
               </w:tc>
               <w:tc>
-                <w:tcPr/>
+                <w:tcPr>
+                  <w:tcBorders>
+                    <w:bottom w:val="none" w:sz="0" w:space="0" w:color="000000"/>
+                    <w:top w:val="single" w:sz="12" w:space="0" w:color="666666"/>
+                    <w:left w:val="none" w:sz="0" w:space="0" w:color="000000"/>
+                    <w:right w:val="none" w:sz="0" w:space="0" w:color="000000"/>
+                  </w:tcBorders>
+                  <w:shd w:val="clear" w:color="auto" w:fill="FFFFFF"/>
+                  <w:tcMar>
+                    <w:top w:w="0" w:type="dxa"/>
+                    <w:bottom w:w="0" w:type="dxa"/>
+                    <w:left w:w="0" w:type="dxa"/>
+                    <w:right w:w="0" w:type="dxa"/>
+                  </w:tcMar>
+                  <w:vAlign w:val="center"/>
+                </w:tcPr>
                 <w:p>
                   <w:pPr>
-                    <w:pStyle w:val="Compact"/>
-                    <w:jc w:val="right"/>
-                    <w:jc w:val="center"/>
+                    <w:jc w:val="left"/>
+                    <w:pBdr>
+                      <w:bottom w:val="none" w:sz="0" w:space="0" w:color="000000"/>
+                      <w:top w:val="none" w:sz="0" w:space="0" w:color="000000"/>
+                      <w:left w:val="none" w:sz="0" w:space="0" w:color="000000"/>
+                      <w:right w:val="none" w:sz="0" w:space="0" w:color="000000"/>
+                    </w:pBdr>
+                    <w:spacing w:after="100" w:before="100" w:line="240"/>
+                    <w:ind w:left="100" w:right="100" w:firstLine="0" w:firstLineChars="0"/>
+                    <w:rPr>
+                      <w:rFonts w:ascii="Carlito" w:hAnsi="Carlito" w:eastAsia="Carlito" w:cs="Carlito"/>
+                      <w:i w:val="false"/>
+                      <w:b w:val="false"/>
+                      <w:u w:val="none"/>
+                      <w:strike w:val="false"/>
+                      <w:sz w:val="22"/>
+                      <w:szCs w:val="22"/>
+                      <w:color w:val="000000"/>
+                    </w:rPr>
                   </w:pPr>
-                  <w:r>
+                  <w:r xmlns:w="http://schemas.openxmlformats.org/wordprocessingml/2006/main" xmlns:wp="http://schemas.openxmlformats.org/drawingml/2006/wordprocessingDrawing" xmlns:r="http://schemas.openxmlformats.org/officeDocument/2006/relationships" xmlns:w14="http://schemas.microsoft.com/office/word/2010/wordml">
+                    <w:rPr>
+                      <w:rFonts w:ascii="Carlito" w:hAnsi="Carlito" w:eastAsia="Carlito" w:cs="Carlito"/>
+                      <w:i w:val="false"/>
+                      <w:b w:val="false"/>
+                      <w:u w:val="none"/>
+                      <w:strike w:val="false"/>
+                      <w:sz w:val="22"/>
+                      <w:szCs w:val="22"/>
+                      <w:color w:val="000000"/>
+                    </w:rPr>
                     <w:t xml:space="preserve">10/28/2025</w:t>
                   </w:r>
                 </w:p>
               </w:tc>
               <w:tc>
-                <w:tcPr/>
+                <w:tcPr>
+                  <w:tcBorders>
+                    <w:bottom w:val="none" w:sz="0" w:space="0" w:color="000000"/>
+                    <w:top w:val="single" w:sz="12" w:space="0" w:color="666666"/>
+                    <w:left w:val="none" w:sz="0" w:space="0" w:color="000000"/>
+                    <w:right w:val="none" w:sz="0" w:space="0" w:color="000000"/>
+                  </w:tcBorders>
+                  <w:shd w:val="clear" w:color="auto" w:fill="FFFFFF"/>
+                  <w:tcMar>
+                    <w:top w:w="0" w:type="dxa"/>
+                    <w:bottom w:w="0" w:type="dxa"/>
+                    <w:left w:w="0" w:type="dxa"/>
+                    <w:right w:w="0" w:type="dxa"/>
+                  </w:tcMar>
+                  <w:vAlign w:val="center"/>
+                </w:tcPr>
                 <w:p>
                   <w:pPr>
-                    <w:pStyle w:val="Compact"/>
                     <w:jc w:val="right"/>
-                    <w:jc w:val="center"/>
+                    <w:pBdr>
+                      <w:bottom w:val="none" w:sz="0" w:space="0" w:color="000000"/>
+                      <w:top w:val="none" w:sz="0" w:space="0" w:color="000000"/>
+                      <w:left w:val="none" w:sz="0" w:space="0" w:color="000000"/>
+                      <w:right w:val="none" w:sz="0" w:space="0" w:color="000000"/>
+                    </w:pBdr>
+                    <w:spacing w:after="100" w:before="100" w:line="240"/>
+                    <w:ind w:left="100" w:right="100" w:firstLine="0" w:firstLineChars="0"/>
+                    <w:rPr>
+                      <w:rFonts w:ascii="Carlito" w:hAnsi="Carlito" w:eastAsia="Carlito" w:cs="Carlito"/>
+                      <w:i w:val="false"/>
+                      <w:b w:val="false"/>
+                      <w:u w:val="none"/>
+                      <w:strike w:val="false"/>
+                      <w:sz w:val="22"/>
+                      <w:szCs w:val="22"/>
+                      <w:color w:val="000000"/>
+                    </w:rPr>
                   </w:pPr>
-                  <w:r>
-                    <w:t xml:space="preserve">10/30/2025</w:t>
+                  <w:r xmlns:w="http://schemas.openxmlformats.org/wordprocessingml/2006/main" xmlns:wp="http://schemas.openxmlformats.org/drawingml/2006/wordprocessingDrawing" xmlns:r="http://schemas.openxmlformats.org/officeDocument/2006/relationships" xmlns:w14="http://schemas.microsoft.com/office/word/2010/wordml">
+                    <w:rPr>
+                      <w:rFonts w:ascii="Carlito" w:hAnsi="Carlito" w:eastAsia="Carlito" w:cs="Carlito"/>
+                      <w:i w:val="false"/>
+                      <w:b w:val="false"/>
+                      <w:u w:val="none"/>
+                      <w:strike w:val="false"/>
+                      <w:sz w:val="22"/>
+                      <w:szCs w:val="22"/>
+                      <w:color w:val="000000"/>
+                    </w:rPr>
+                    <w:t xml:space="preserve">2025-10-30</w:t>
                   </w:r>
                 </w:p>
               </w:tc>
               <w:tc>
-                <w:tcPr/>
+                <w:tcPr>
+                  <w:tcBorders>
+                    <w:bottom w:val="none" w:sz="0" w:space="0" w:color="000000"/>
+                    <w:top w:val="single" w:sz="12" w:space="0" w:color="666666"/>
+                    <w:left w:val="none" w:sz="0" w:space="0" w:color="000000"/>
+                    <w:right w:val="none" w:sz="0" w:space="0" w:color="000000"/>
+                  </w:tcBorders>
+                  <w:shd w:val="clear" w:color="auto" w:fill="FFFFFF"/>
+                  <w:tcMar>
+                    <w:top w:w="0" w:type="dxa"/>
+                    <w:bottom w:w="0" w:type="dxa"/>
+                    <w:left w:w="0" w:type="dxa"/>
+                    <w:right w:w="0" w:type="dxa"/>
+                  </w:tcMar>
+                  <w:vAlign w:val="center"/>
+                </w:tcPr>
                 <w:p>
                   <w:pPr>
-                    <w:pStyle w:val="Compact"/>
-                    <w:jc w:val="right"/>
-                    <w:jc w:val="center"/>
+                    <w:jc w:val="left"/>
+                    <w:pBdr>
+                      <w:bottom w:val="none" w:sz="0" w:space="0" w:color="000000"/>
+                      <w:top w:val="none" w:sz="0" w:space="0" w:color="000000"/>
+                      <w:left w:val="none" w:sz="0" w:space="0" w:color="000000"/>
+                      <w:right w:val="none" w:sz="0" w:space="0" w:color="000000"/>
+                    </w:pBdr>
+                    <w:spacing w:after="100" w:before="100" w:line="240"/>
+                    <w:ind w:left="100" w:right="100" w:firstLine="0" w:firstLineChars="0"/>
+                    <w:rPr>
+                      <w:rFonts w:ascii="Carlito" w:hAnsi="Carlito" w:eastAsia="Carlito" w:cs="Carlito"/>
+                      <w:i w:val="false"/>
+                      <w:b w:val="false"/>
+                      <w:u w:val="none"/>
+                      <w:strike w:val="false"/>
+                      <w:sz w:val="22"/>
+                      <w:szCs w:val="22"/>
+                      <w:color w:val="000000"/>
+                    </w:rPr>
                   </w:pPr>
-                  <w:r>
+                  <w:r xmlns:w="http://schemas.openxmlformats.org/wordprocessingml/2006/main" xmlns:wp="http://schemas.openxmlformats.org/drawingml/2006/wordprocessingDrawing" xmlns:r="http://schemas.openxmlformats.org/officeDocument/2006/relationships" xmlns:w14="http://schemas.microsoft.com/office/word/2010/wordml">
+                    <w:rPr>
+                      <w:rFonts w:ascii="Carlito" w:hAnsi="Carlito" w:eastAsia="Carlito" w:cs="Carlito"/>
+                      <w:i w:val="false"/>
+                      <w:b w:val="false"/>
+                      <w:u w:val="none"/>
+                      <w:strike w:val="false"/>
+                      <w:sz w:val="22"/>
+                      <w:szCs w:val="22"/>
+                      <w:color w:val="000000"/>
+                    </w:rPr>
                     <w:t xml:space="preserve">Ongoing</w:t>
                   </w:r>
                 </w:p>
               </w:tc>
               <w:tc>
-                <w:tcPr/>
+                <w:tcPr>
+                  <w:tcBorders>
+                    <w:bottom w:val="none" w:sz="0" w:space="0" w:color="000000"/>
+                    <w:top w:val="single" w:sz="12" w:space="0" w:color="666666"/>
+                    <w:left w:val="none" w:sz="0" w:space="0" w:color="000000"/>
+                    <w:right w:val="none" w:sz="0" w:space="0" w:color="000000"/>
+                  </w:tcBorders>
+                  <w:shd w:val="clear" w:color="auto" w:fill="FFFFFF"/>
+                  <w:tcMar>
+                    <w:top w:w="0" w:type="dxa"/>
+                    <w:bottom w:w="0" w:type="dxa"/>
+                    <w:left w:w="0" w:type="dxa"/>
+                    <w:right w:w="0" w:type="dxa"/>
+                  </w:tcMar>
+                  <w:vAlign w:val="center"/>
+                </w:tcPr>
                 <w:p>
                   <w:pPr>
-                    <w:pStyle w:val="Compact"/>
-                    <w:jc w:val="right"/>
-                    <w:jc w:val="center"/>
+                    <w:jc w:val="left"/>
+                    <w:pBdr>
+                      <w:bottom w:val="none" w:sz="0" w:space="0" w:color="000000"/>
+                      <w:top w:val="none" w:sz="0" w:space="0" w:color="000000"/>
+                      <w:left w:val="none" w:sz="0" w:space="0" w:color="000000"/>
+                      <w:right w:val="none" w:sz="0" w:space="0" w:color="000000"/>
+                    </w:pBdr>
+                    <w:spacing w:after="100" w:before="100" w:line="240"/>
+                    <w:ind w:left="100" w:right="100" w:firstLine="0" w:firstLineChars="0"/>
+                    <w:rPr>
+                      <w:rFonts w:ascii="Carlito" w:hAnsi="Carlito" w:eastAsia="Carlito" w:cs="Carlito"/>
+                      <w:i w:val="false"/>
+                      <w:b w:val="false"/>
+                      <w:u w:val="none"/>
+                      <w:strike w:val="false"/>
+                      <w:sz w:val="22"/>
+                      <w:szCs w:val="22"/>
+                      <w:color w:val="000000"/>
+                    </w:rPr>
                   </w:pPr>
-                  <w:r>
+                  <w:r xmlns:w="http://schemas.openxmlformats.org/wordprocessingml/2006/main" xmlns:wp="http://schemas.openxmlformats.org/drawingml/2006/wordprocessingDrawing" xmlns:r="http://schemas.openxmlformats.org/officeDocument/2006/relationships" xmlns:w14="http://schemas.microsoft.com/office/word/2010/wordml">
+                    <w:rPr>
+                      <w:rFonts w:ascii="Carlito" w:hAnsi="Carlito" w:eastAsia="Carlito" w:cs="Carlito"/>
+                      <w:i w:val="false"/>
+                      <w:b w:val="false"/>
+                      <w:u w:val="none"/>
+                      <w:strike w:val="false"/>
+                      <w:sz w:val="22"/>
+                      <w:szCs w:val="22"/>
+                      <w:color w:val="000000"/>
+                    </w:rPr>
                     <w:t xml:space="preserve">DCC gates</w:t>
                   </w:r>
                 </w:p>
               </w:tc>
             </w:tr>
             <w:tr>
+              <w:trPr>
+                <w:trHeight w:val="360" w:hRule="auto"/>
+              </w:trPr>
+              body2
               <w:tc>
-                <w:tcPr/>
+                <w:tcPr>
+                  <w:tcBorders>
+                    <w:bottom w:val="single" w:sz="12" w:space="0" w:color="666666"/>
+                    <w:top w:val="none" w:sz="0" w:space="0" w:color="000000"/>
+                    <w:left w:val="none" w:sz="0" w:space="0" w:color="000000"/>
+                    <w:right w:val="none" w:sz="0" w:space="0" w:color="000000"/>
+                  </w:tcBorders>
+                  <w:shd w:val="clear" w:color="auto" w:fill="FFFFFF"/>
+                  <w:tcMar>
+                    <w:top w:w="0" w:type="dxa"/>
+                    <w:bottom w:w="0" w:type="dxa"/>
+                    <w:left w:w="0" w:type="dxa"/>
+                    <w:right w:w="0" w:type="dxa"/>
+                  </w:tcMar>
+                  <w:vAlign w:val="center"/>
+                </w:tcPr>
                 <w:p>
                   <w:pPr>
-                    <w:pStyle w:val="Compact"/>
-                    <w:jc w:val="left"/>
-                    <w:jc w:val="center"/>
+                    <w:jc w:val="right"/>
+                    <w:pBdr>
+                      <w:bottom w:val="none" w:sz="0" w:space="0" w:color="000000"/>
+                      <w:top w:val="none" w:sz="0" w:space="0" w:color="000000"/>
+                      <w:left w:val="none" w:sz="0" w:space="0" w:color="000000"/>
+                      <w:right w:val="none" w:sz="0" w:space="0" w:color="000000"/>
+                    </w:pBdr>
+                    <w:spacing w:after="100" w:before="100" w:line="240"/>
+                    <w:ind w:left="100" w:right="100" w:firstLine="0" w:firstLineChars="0"/>
+                    <w:rPr>
+                      <w:rFonts w:ascii="Carlito" w:hAnsi="Carlito" w:eastAsia="Carlito" w:cs="Carlito"/>
+                      <w:i w:val="false"/>
+                      <w:b w:val="false"/>
+                      <w:u w:val="none"/>
+                      <w:strike w:val="false"/>
+                      <w:sz w:val="22"/>
+                      <w:szCs w:val="22"/>
+                      <w:color w:val="000000"/>
+                    </w:rPr>
                   </w:pPr>
-                  <w:r>
+                  <w:r xmlns:w="http://schemas.openxmlformats.org/wordprocessingml/2006/main" xmlns:wp="http://schemas.openxmlformats.org/drawingml/2006/wordprocessingDrawing" xmlns:r="http://schemas.openxmlformats.org/officeDocument/2006/relationships" xmlns:w14="http://schemas.microsoft.com/office/word/2010/wordml">
+                    <w:rPr>
+                      <w:rFonts w:ascii="Carlito" w:hAnsi="Carlito" w:eastAsia="Carlito" w:cs="Carlito"/>
+                      <w:i w:val="false"/>
+                      <w:b w:val="false"/>
+                      <w:u w:val="none"/>
+                      <w:strike w:val="false"/>
+                      <w:sz w:val="22"/>
+                      <w:szCs w:val="22"/>
+                      <w:color w:val="000000"/>
+                    </w:rPr>
                     <w:t xml:space="preserve">2</w:t>
                   </w:r>
                 </w:p>
               </w:tc>
               <w:tc>
-                <w:tcPr/>
+                <w:tcPr>
+                  <w:tcBorders>
+                    <w:bottom w:val="single" w:sz="12" w:space="0" w:color="666666"/>
+                    <w:top w:val="none" w:sz="0" w:space="0" w:color="000000"/>
+                    <w:left w:val="none" w:sz="0" w:space="0" w:color="000000"/>
+                    <w:right w:val="none" w:sz="0" w:space="0" w:color="000000"/>
+                  </w:tcBorders>
+                  <w:shd w:val="clear" w:color="auto" w:fill="FFFFFF"/>
+                  <w:tcMar>
+                    <w:top w:w="0" w:type="dxa"/>
+                    <w:bottom w:w="0" w:type="dxa"/>
+                    <w:left w:w="0" w:type="dxa"/>
+                    <w:right w:w="0" w:type="dxa"/>
+                  </w:tcMar>
+                  <w:vAlign w:val="center"/>
+                </w:tcPr>
                 <w:p>
                   <w:pPr>
-                    <w:pStyle w:val="Compact"/>
-                    <w:jc w:val="right"/>
-                    <w:jc w:val="center"/>
+                    <w:jc w:val="left"/>
+                    <w:pBdr>
+                      <w:bottom w:val="none" w:sz="0" w:space="0" w:color="000000"/>
+                      <w:top w:val="none" w:sz="0" w:space="0" w:color="000000"/>
+                      <w:left w:val="none" w:sz="0" w:space="0" w:color="000000"/>
+                      <w:right w:val="none" w:sz="0" w:space="0" w:color="000000"/>
+                    </w:pBdr>
+                    <w:spacing w:after="100" w:before="100" w:line="240"/>
+                    <w:ind w:left="100" w:right="100" w:firstLine="0" w:firstLineChars="0"/>
+                    <w:rPr>
+                      <w:rFonts w:ascii="Carlito" w:hAnsi="Carlito" w:eastAsia="Carlito" w:cs="Carlito"/>
+                      <w:i w:val="false"/>
+                      <w:b w:val="false"/>
+                      <w:u w:val="none"/>
+                      <w:strike w:val="false"/>
+                      <w:sz w:val="22"/>
+                      <w:szCs w:val="22"/>
+                      <w:color w:val="000000"/>
+                    </w:rPr>
                   </w:pPr>
-                  <w:r>
+                  <w:r xmlns:w="http://schemas.openxmlformats.org/wordprocessingml/2006/main" xmlns:wp="http://schemas.openxmlformats.org/drawingml/2006/wordprocessingDrawing" xmlns:r="http://schemas.openxmlformats.org/officeDocument/2006/relationships" xmlns:w14="http://schemas.microsoft.com/office/word/2010/wordml">
+                    <w:rPr>
+                      <w:rFonts w:ascii="Carlito" w:hAnsi="Carlito" w:eastAsia="Carlito" w:cs="Carlito"/>
+                      <w:i w:val="false"/>
+                      <w:b w:val="false"/>
+                      <w:u w:val="none"/>
+                      <w:strike w:val="false"/>
+                      <w:sz w:val="22"/>
+                      <w:szCs w:val="22"/>
+                      <w:color w:val="000000"/>
+                    </w:rPr>
                     <w:t xml:space="preserve">First Flush</w:t>
                   </w:r>
                 </w:p>
               </w:tc>
               <w:tc>
-                <w:tcPr/>
+                <w:tcPr>
+                  <w:tcBorders>
+                    <w:bottom w:val="single" w:sz="12" w:space="0" w:color="666666"/>
+                    <w:top w:val="none" w:sz="0" w:space="0" w:color="000000"/>
+                    <w:left w:val="none" w:sz="0" w:space="0" w:color="000000"/>
+                    <w:right w:val="none" w:sz="0" w:space="0" w:color="000000"/>
+                  </w:tcBorders>
+                  <w:shd w:val="clear" w:color="auto" w:fill="FFFFFF"/>
+                  <w:tcMar>
+                    <w:top w:w="0" w:type="dxa"/>
+                    <w:bottom w:w="0" w:type="dxa"/>
+                    <w:left w:w="0" w:type="dxa"/>
+                    <w:right w:w="0" w:type="dxa"/>
+                  </w:tcMar>
+                  <w:vAlign w:val="center"/>
+                </w:tcPr>
                 <w:p>
                   <w:pPr>
-                    <w:pStyle w:val="Compact"/>
-                    <w:jc w:val="right"/>
-                    <w:jc w:val="center"/>
+                    <w:jc w:val="left"/>
+                    <w:pBdr>
+                      <w:bottom w:val="none" w:sz="0" w:space="0" w:color="000000"/>
+                      <w:top w:val="none" w:sz="0" w:space="0" w:color="000000"/>
+                      <w:left w:val="none" w:sz="0" w:space="0" w:color="000000"/>
+                      <w:right w:val="none" w:sz="0" w:space="0" w:color="000000"/>
+                    </w:pBdr>
+                    <w:spacing w:after="100" w:before="100" w:line="240"/>
+                    <w:ind w:left="100" w:right="100" w:firstLine="0" w:firstLineChars="0"/>
+                    <w:rPr>
+                      <w:rFonts w:ascii="Carlito" w:hAnsi="Carlito" w:eastAsia="Carlito" w:cs="Carlito"/>
+                      <w:i w:val="false"/>
+                      <w:b w:val="false"/>
+                      <w:u w:val="none"/>
+                      <w:strike w:val="false"/>
+                      <w:sz w:val="22"/>
+                      <w:szCs w:val="22"/>
+                      <w:color w:val="000000"/>
+                    </w:rPr>
                   </w:pPr>
-                  <w:r>
+                  <w:r xmlns:w="http://schemas.openxmlformats.org/wordprocessingml/2006/main" xmlns:wp="http://schemas.openxmlformats.org/drawingml/2006/wordprocessingDrawing" xmlns:r="http://schemas.openxmlformats.org/officeDocument/2006/relationships" xmlns:w14="http://schemas.microsoft.com/office/word/2010/wordml">
+                    <w:rPr>
+                      <w:rFonts w:ascii="Carlito" w:hAnsi="Carlito" w:eastAsia="Carlito" w:cs="Carlito"/>
+                      <w:i w:val="false"/>
+                      <w:b w:val="false"/>
+                      <w:u w:val="none"/>
+                      <w:strike w:val="false"/>
+                      <w:sz w:val="22"/>
+                      <w:szCs w:val="22"/>
+                      <w:color w:val="000000"/>
+                    </w:rPr>
                     <w:t xml:space="preserve">12/24/2025</w:t>
                   </w:r>
                 </w:p>
               </w:tc>
               <w:tc>
-                <w:tcPr/>
+                <w:tcPr>
+                  <w:tcBorders>
+                    <w:bottom w:val="single" w:sz="12" w:space="0" w:color="666666"/>
+                    <w:top w:val="none" w:sz="0" w:space="0" w:color="000000"/>
+                    <w:left w:val="none" w:sz="0" w:space="0" w:color="000000"/>
+                    <w:right w:val="none" w:sz="0" w:space="0" w:color="000000"/>
+                  </w:tcBorders>
+                  <w:shd w:val="clear" w:color="auto" w:fill="FFFFFF"/>
+                  <w:tcMar>
+                    <w:top w:w="0" w:type="dxa"/>
+                    <w:bottom w:w="0" w:type="dxa"/>
+                    <w:left w:w="0" w:type="dxa"/>
+                    <w:right w:w="0" w:type="dxa"/>
+                  </w:tcMar>
+                  <w:vAlign w:val="center"/>
+                </w:tcPr>
                 <w:p>
                   <w:pPr>
-                    <w:pStyle w:val="Compact"/>
                     <w:jc w:val="right"/>
-                    <w:jc w:val="center"/>
+                    <w:pBdr>
+                      <w:bottom w:val="none" w:sz="0" w:space="0" w:color="000000"/>
+                      <w:top w:val="none" w:sz="0" w:space="0" w:color="000000"/>
+                      <w:left w:val="none" w:sz="0" w:space="0" w:color="000000"/>
+                      <w:right w:val="none" w:sz="0" w:space="0" w:color="000000"/>
+                    </w:pBdr>
+                    <w:spacing w:after="100" w:before="100" w:line="240"/>
+                    <w:ind w:left="100" w:right="100" w:firstLine="0" w:firstLineChars="0"/>
+                    <w:rPr>
+                      <w:rFonts w:ascii="Carlito" w:hAnsi="Carlito" w:eastAsia="Carlito" w:cs="Carlito"/>
+                      <w:i w:val="false"/>
+                      <w:b w:val="false"/>
+                      <w:u w:val="none"/>
+                      <w:strike w:val="false"/>
+                      <w:sz w:val="22"/>
+                      <w:szCs w:val="22"/>
+                      <w:color w:val="000000"/>
+                    </w:rPr>
                   </w:pPr>
-                  <w:r>
-                    <w:t xml:space="preserve">12/25/2025</w:t>
+                  <w:r xmlns:w="http://schemas.openxmlformats.org/wordprocessingml/2006/main" xmlns:wp="http://schemas.openxmlformats.org/drawingml/2006/wordprocessingDrawing" xmlns:r="http://schemas.openxmlformats.org/officeDocument/2006/relationships" xmlns:w14="http://schemas.microsoft.com/office/word/2010/wordml">
+                    <w:rPr>
+                      <w:rFonts w:ascii="Carlito" w:hAnsi="Carlito" w:eastAsia="Carlito" w:cs="Carlito"/>
+                      <w:i w:val="false"/>
+                      <w:b w:val="false"/>
+                      <w:u w:val="none"/>
+                      <w:strike w:val="false"/>
+                      <w:sz w:val="22"/>
+                      <w:szCs w:val="22"/>
+                      <w:color w:val="000000"/>
+                    </w:rPr>
+                    <w:t xml:space="preserve">2025-12-25</w:t>
                   </w:r>
                 </w:p>
               </w:tc>
               <w:tc>
-                <w:tcPr/>
+                <w:tcPr>
+                  <w:tcBorders>
+                    <w:bottom w:val="single" w:sz="12" w:space="0" w:color="666666"/>
+                    <w:top w:val="none" w:sz="0" w:space="0" w:color="000000"/>
+                    <w:left w:val="none" w:sz="0" w:space="0" w:color="000000"/>
+                    <w:right w:val="none" w:sz="0" w:space="0" w:color="000000"/>
+                  </w:tcBorders>
+                  <w:shd w:val="clear" w:color="auto" w:fill="FFFFFF"/>
+                  <w:tcMar>
+                    <w:top w:w="0" w:type="dxa"/>
+                    <w:bottom w:w="0" w:type="dxa"/>
+                    <w:left w:w="0" w:type="dxa"/>
+                    <w:right w:w="0" w:type="dxa"/>
+                  </w:tcMar>
+                  <w:vAlign w:val="center"/>
+                </w:tcPr>
                 <w:p>
                   <w:pPr>
-                    <w:pStyle w:val="Compact"/>
-                    <w:jc w:val="right"/>
-                    <w:jc w:val="center"/>
+                    <w:jc w:val="left"/>
+                    <w:pBdr>
+                      <w:bottom w:val="none" w:sz="0" w:space="0" w:color="000000"/>
+                      <w:top w:val="none" w:sz="0" w:space="0" w:color="000000"/>
+                      <w:left w:val="none" w:sz="0" w:space="0" w:color="000000"/>
+                      <w:right w:val="none" w:sz="0" w:space="0" w:color="000000"/>
+                    </w:pBdr>
+                    <w:spacing w:after="100" w:before="100" w:line="240"/>
+                    <w:ind w:left="100" w:right="100" w:firstLine="0" w:firstLineChars="0"/>
+                    <w:rPr>
+                      <w:rFonts w:ascii="Carlito" w:hAnsi="Carlito" w:eastAsia="Carlito" w:cs="Carlito"/>
+                      <w:i w:val="false"/>
+                      <w:b w:val="false"/>
+                      <w:u w:val="none"/>
+                      <w:strike w:val="false"/>
+                      <w:sz w:val="22"/>
+                      <w:szCs w:val="22"/>
+                      <w:color w:val="000000"/>
+                    </w:rPr>
                   </w:pPr>
-                  <w:r>
-                    <w:t xml:space="preserve">Ongoing</w:t>
+                  <w:r xmlns:w="http://schemas.openxmlformats.org/wordprocessingml/2006/main" xmlns:wp="http://schemas.openxmlformats.org/drawingml/2006/wordprocessingDrawing" xmlns:r="http://schemas.openxmlformats.org/officeDocument/2006/relationships" xmlns:w14="http://schemas.microsoft.com/office/word/2010/wordml">
+                    <w:rPr>
+                      <w:rFonts w:ascii="Carlito" w:hAnsi="Carlito" w:eastAsia="Carlito" w:cs="Carlito"/>
+                      <w:i w:val="false"/>
+                      <w:b w:val="false"/>
+                      <w:u w:val="none"/>
+                      <w:strike w:val="false"/>
+                      <w:sz w:val="22"/>
+                      <w:szCs w:val="22"/>
+                      <w:color w:val="000000"/>
+                    </w:rPr>
+                    <w:t xml:space="preserve">14 days</w:t>
                   </w:r>
                 </w:p>
               </w:tc>
               <w:tc>
-                <w:tcPr/>
+                <w:tcPr>
+                  <w:tcBorders>
+                    <w:bottom w:val="single" w:sz="12" w:space="0" w:color="666666"/>
+                    <w:top w:val="none" w:sz="0" w:space="0" w:color="000000"/>
+                    <w:left w:val="none" w:sz="0" w:space="0" w:color="000000"/>
+                    <w:right w:val="none" w:sz="0" w:space="0" w:color="000000"/>
+                  </w:tcBorders>
+                  <w:shd w:val="clear" w:color="auto" w:fill="FFFFFF"/>
+                  <w:tcMar>
+                    <w:top w:w="0" w:type="dxa"/>
+                    <w:bottom w:w="0" w:type="dxa"/>
+                    <w:left w:w="0" w:type="dxa"/>
+                    <w:right w:w="0" w:type="dxa"/>
+                  </w:tcMar>
+                  <w:vAlign w:val="center"/>
+                </w:tcPr>
                 <w:p>
                   <w:pPr>
-                    <w:pStyle w:val="Compact"/>
-                    <w:jc w:val="right"/>
-                    <w:jc w:val="center"/>
+                    <w:jc w:val="left"/>
+                    <w:pBdr>
+                      <w:bottom w:val="none" w:sz="0" w:space="0" w:color="000000"/>
+                      <w:top w:val="none" w:sz="0" w:space="0" w:color="000000"/>
+                      <w:left w:val="none" w:sz="0" w:space="0" w:color="000000"/>
+                      <w:right w:val="none" w:sz="0" w:space="0" w:color="000000"/>
+                    </w:pBdr>
+                    <w:spacing w:after="100" w:before="100" w:line="240"/>
+                    <w:ind w:left="100" w:right="100" w:firstLine="0" w:firstLineChars="0"/>
+                    <w:rPr>
+                      <w:rFonts w:ascii="Carlito" w:hAnsi="Carlito" w:eastAsia="Carlito" w:cs="Carlito"/>
+                      <w:i w:val="false"/>
+                      <w:b w:val="false"/>
+                      <w:u w:val="none"/>
+                      <w:strike w:val="false"/>
+                      <w:sz w:val="22"/>
+                      <w:szCs w:val="22"/>
+                      <w:color w:val="000000"/>
+                    </w:rPr>
                   </w:pPr>
-                  <w:r>
+                  <w:r xmlns:w="http://schemas.openxmlformats.org/wordprocessingml/2006/main" xmlns:wp="http://schemas.openxmlformats.org/drawingml/2006/wordprocessingDrawing" xmlns:r="http://schemas.openxmlformats.org/officeDocument/2006/relationships" xmlns:w14="http://schemas.microsoft.com/office/word/2010/wordml">
+                    <w:rPr>
+                      <w:rFonts w:ascii="Carlito" w:hAnsi="Carlito" w:eastAsia="Carlito" w:cs="Carlito"/>
+                      <w:i w:val="false"/>
+                      <w:b w:val="false"/>
+                      <w:u w:val="none"/>
+                      <w:strike w:val="false"/>
+                      <w:sz w:val="22"/>
+                      <w:szCs w:val="22"/>
+                      <w:color w:val="000000"/>
+                    </w:rPr>
                     <w:t xml:space="preserve">Entrainment Management</w:t>
                   </w:r>
                 </w:p>
@@ -430,7 +1177,6 @@
             </w:tr>
           </w:tbl>
           <w:bookmarkEnd w:id="25"/>
-          <w:p/>
         </w:tc>
       </w:tr>
     </w:tbl>
@@ -503,7 +1249,7 @@
         <w:t xml:space="preserve"> </w:t>
       </w:r>
       <w:r>
-        <w:t xml:space="preserve">‘himed’</w:t>
+        <w:t xml:space="preserve">‘medmed’</w:t>
       </w:r>
       <w:r>
         <w:t xml:space="preserve"> </w:t>
@@ -535,13 +1281,13 @@
         <w:t xml:space="preserve"> </w:t>
       </w:r>
       <w:r>
-        <w:t xml:space="preserve">“himed”</w:t>
+        <w:t xml:space="preserve">“medmed”</w:t>
       </w:r>
       <w:r>
         <w:t xml:space="preserve"> </w:t>
       </w:r>
       <w:r>
-        <w:t xml:space="preserve">hydrology is 23, 53, 118 and 111 kilometeres (km) across OMR bins of -2000, -3500, -5000 and &lt;-5500 respectively.</w:t>
+        <w:t xml:space="preserve">hydrology is 26, 49, 101 and 163 kilometeres (km) across OMR bins of -2000, -3500, -5000 and &lt;-5500 respectively.</w:t>
       </w:r>
     </w:p>
     <w:p>
@@ -549,7 +1295,7 @@
         <w:pStyle w:val="BodyText"/>
       </w:pPr>
       <w:r>
-        <w:t xml:space="preserve">Change in altered channel length between OMR levels is 88 km for current conditions and 88 km for forecasted conditions indicating that ZOI impacts across OMR scenarios would not change between current and forecasted conditions. Across the nine hydrology bins, changes in altered channel length across OMR scenarios are moderate (between 25th and 75th percentiles) for both current and forecasted hydrology.</w:t>
+        <w:t xml:space="preserve">Change in altered channel length between OMR levels is 88 km for current conditions and 137 km for forecasted conditions indicating that ZOI impacts across OMR scenarios would increase between current and forecasted conditions. Across the nine hydrology bins, changes in altered channel length across OMR scenarios are moderate (between 25th and 75th percentiles) and high (&gt;75th percentile) respectively for current and forecasted hydrology.</w:t>
       </w:r>
     </w:p>
     <w:tbl>
@@ -574,7 +1320,7 @@
             <w:r>
               <w:drawing>
                 <wp:inline>
-                  <wp:extent cx="5334000" cy="2667000"/>
+                  <wp:extent cx="5943600" cy="2971800"/>
                   <wp:effectExtent b="0" l="0" r="0" t="0"/>
                   <wp:docPr descr="" title="" id="30" name="Picture"/>
                   <a:graphic>
@@ -595,7 +1341,7 @@
                         <pic:spPr bwMode="auto">
                           <a:xfrm>
                             <a:off x="0" y="0"/>
-                            <a:ext cx="5334000" cy="2667000"/>
+                            <a:ext cx="5943600" cy="2971800"/>
                           </a:xfrm>
                           <a:prstGeom prst="rect">
                             <a:avLst/>
@@ -634,9 +1380,18 @@
     <w:bookmarkEnd w:id="33"/>
     <w:bookmarkEnd w:id="34"/>
     <w:sectPr>
+      <w:headerReference r:id="rId9" w:type="even"/>
+      <w:headerReference r:id="rId11" w:type="default"/>
+      <w:footerReference r:id="rId14" w:type="even"/>
+      <w:footerReference r:id="rId13" w:type="default"/>
+      <w:headerReference r:id="rId10" w:type="first"/>
+      <w:footerReference r:id="rId12" w:type="first"/>
       <w:footnotePr>
         <w:numRestart w:val="eachSect"/>
       </w:footnotePr>
+      <w:pgSz w:h="15840" w:w="12240"/>
+      <w:pgMar w:bottom="1440" w:footer="720" w:gutter="0" w:header="720" w:left="1440" w:right="1440" w:top="1440"/>
+      <w:cols w:space="720"/>
     </w:sectPr>
   </w:body>
 </w:document>
@@ -646,6 +1401,79 @@
 <w:comments xmlns:w="http://schemas.openxmlformats.org/wordprocessingml/2006/main" xmlns:m="http://schemas.openxmlformats.org/officeDocument/2006/math" xmlns:r="http://schemas.openxmlformats.org/officeDocument/2006/relationships" xmlns:o="urn:schemas-microsoft-com:office:office" xmlns:v="urn:schemas-microsoft-com:vml" xmlns:w10="urn:schemas-microsoft-com:office:word" xmlns:a="http://schemas.openxmlformats.org/drawingml/2006/main" xmlns:pic="http://schemas.openxmlformats.org/drawingml/2006/picture" xmlns:wp="http://schemas.openxmlformats.org/drawingml/2006/wordprocessingDrawing"/>
 </file>
 
+<file path=word/footer1.xml><?xml version="1.0" encoding="utf-8"?>
+<w:ftr xmlns:wpc="http://schemas.microsoft.com/office/word/2010/wordprocessingCanvas" xmlns:cx="http://schemas.microsoft.com/office/drawing/2014/chartex" xmlns:cx1="http://schemas.microsoft.com/office/drawing/2015/9/8/chartex" xmlns:cx2="http://schemas.microsoft.com/office/drawing/2015/10/21/chartex" xmlns:cx3="http://schemas.microsoft.com/office/drawing/2016/5/9/chartex" xmlns:cx4="http://schemas.microsoft.com/office/drawing/2016/5/10/chartex" xmlns:cx5="http://schemas.microsoft.com/office/drawing/2016/5/11/chartex" xmlns:cx6="http://schemas.microsoft.com/office/drawing/2016/5/12/chartex" xmlns:cx7="http://schemas.microsoft.com/office/drawing/2016/5/13/chartex" xmlns:cx8="http://schemas.microsoft.com/office/drawing/2016/5/14/chartex" xmlns:mc="http://schemas.openxmlformats.org/markup-compatibility/2006" xmlns:aink="http://schemas.microsoft.com/office/drawing/2016/ink" xmlns:am3d="http://schemas.microsoft.com/office/drawing/2017/model3d" xmlns:o="urn:schemas-microsoft-com:office:office" xmlns:oel="http://schemas.microsoft.com/office/2019/extlst" xmlns:r="http://schemas.openxmlformats.org/officeDocument/2006/relationships" xmlns:m="http://schemas.openxmlformats.org/officeDocument/2006/math" xmlns:v="urn:schemas-microsoft-com:vml" xmlns:wp14="http://schemas.microsoft.com/office/word/2010/wordprocessingDrawing" xmlns:wp="http://schemas.openxmlformats.org/drawingml/2006/wordprocessingDrawing" xmlns:w10="urn:schemas-microsoft-com:office:word" xmlns:w="http://schemas.openxmlformats.org/wordprocessingml/2006/main" xmlns:w14="http://schemas.microsoft.com/office/word/2010/wordml" xmlns:w15="http://schemas.microsoft.com/office/word/2012/wordml" xmlns:w16cex="http://schemas.microsoft.com/office/word/2018/wordml/cex" xmlns:w16cid="http://schemas.microsoft.com/office/word/2016/wordml/cid" xmlns:w16="http://schemas.microsoft.com/office/word/2018/wordml" xmlns:w16du="http://schemas.microsoft.com/office/word/2023/wordml/word16du" xmlns:w16sdtdh="http://schemas.microsoft.com/office/word/2020/wordml/sdtdatahash" xmlns:w16sdtfl="http://schemas.microsoft.com/office/word/2024/wordml/sdtformatlock" xmlns:w16se="http://schemas.microsoft.com/office/word/2015/wordml/symex" xmlns:wpg="http://schemas.microsoft.com/office/word/2010/wordprocessingGroup" xmlns:wpi="http://schemas.microsoft.com/office/word/2010/wordprocessingInk" xmlns:wne="http://schemas.microsoft.com/office/word/2006/wordml" xmlns:wps="http://schemas.microsoft.com/office/word/2010/wordprocessingShape" mc:Ignorable="w14 w15 w16se w16cid w16 w16cex w16sdtdh w16sdtfl w16du wp14">
+  <w:p>
+    <w:pPr>
+      <w:pStyle w:val="Footer"/>
+    </w:pPr>
+  </w:p>
+</w:ftr>
+</file>
+
+<file path=word/footer2.xml><?xml version="1.0" encoding="utf-8"?>
+<w:ftr xmlns:wpc="http://schemas.microsoft.com/office/word/2010/wordprocessingCanvas" xmlns:cx="http://schemas.microsoft.com/office/drawing/2014/chartex" xmlns:cx1="http://schemas.microsoft.com/office/drawing/2015/9/8/chartex" xmlns:cx2="http://schemas.microsoft.com/office/drawing/2015/10/21/chartex" xmlns:cx3="http://schemas.microsoft.com/office/drawing/2016/5/9/chartex" xmlns:cx4="http://schemas.microsoft.com/office/drawing/2016/5/10/chartex" xmlns:cx5="http://schemas.microsoft.com/office/drawing/2016/5/11/chartex" xmlns:cx6="http://schemas.microsoft.com/office/drawing/2016/5/12/chartex" xmlns:cx7="http://schemas.microsoft.com/office/drawing/2016/5/13/chartex" xmlns:cx8="http://schemas.microsoft.com/office/drawing/2016/5/14/chartex" xmlns:mc="http://schemas.openxmlformats.org/markup-compatibility/2006" xmlns:aink="http://schemas.microsoft.com/office/drawing/2016/ink" xmlns:am3d="http://schemas.microsoft.com/office/drawing/2017/model3d" xmlns:o="urn:schemas-microsoft-com:office:office" xmlns:oel="http://schemas.microsoft.com/office/2019/extlst" xmlns:r="http://schemas.openxmlformats.org/officeDocument/2006/relationships" xmlns:m="http://schemas.openxmlformats.org/officeDocument/2006/math" xmlns:v="urn:schemas-microsoft-com:vml" xmlns:wp14="http://schemas.microsoft.com/office/word/2010/wordprocessingDrawing" xmlns:wp="http://schemas.openxmlformats.org/drawingml/2006/wordprocessingDrawing" xmlns:w10="urn:schemas-microsoft-com:office:word" xmlns:w="http://schemas.openxmlformats.org/wordprocessingml/2006/main" xmlns:w14="http://schemas.microsoft.com/office/word/2010/wordml" xmlns:w15="http://schemas.microsoft.com/office/word/2012/wordml" xmlns:w16cex="http://schemas.microsoft.com/office/word/2018/wordml/cex" xmlns:w16cid="http://schemas.microsoft.com/office/word/2016/wordml/cid" xmlns:w16="http://schemas.microsoft.com/office/word/2018/wordml" xmlns:w16du="http://schemas.microsoft.com/office/word/2023/wordml/word16du" xmlns:w16sdtdh="http://schemas.microsoft.com/office/word/2020/wordml/sdtdatahash" xmlns:w16sdtfl="http://schemas.microsoft.com/office/word/2024/wordml/sdtformatlock" xmlns:w16se="http://schemas.microsoft.com/office/word/2015/wordml/symex" xmlns:wpg="http://schemas.microsoft.com/office/word/2010/wordprocessingGroup" xmlns:wpi="http://schemas.microsoft.com/office/word/2010/wordprocessingInk" xmlns:wne="http://schemas.microsoft.com/office/word/2006/wordml" xmlns:wps="http://schemas.microsoft.com/office/word/2010/wordprocessingShape" mc:Ignorable="w14 w15 w16se w16cid w16 w16cex w16sdtdh w16sdtfl w16du wp14">
+  <w:sdt>
+    <w:sdtPr>
+      <w:id w:val="674071887"/>
+      <w:docPartObj>
+        <w:docPartGallery w:val="Page Numbers (Bottom of Page)"/>
+        <w:docPartUnique/>
+      </w:docPartObj>
+    </w:sdtPr>
+    <w:sdtEndPr>
+      <w:rPr>
+        <w:noProof/>
+      </w:rPr>
+    </w:sdtEndPr>
+    <w:sdtContent>
+      <w:p>
+        <w:pPr>
+          <w:pStyle w:val="Footer"/>
+          <w:jc w:val="right"/>
+        </w:pPr>
+        <w:r>
+          <w:fldChar w:fldCharType="begin"/>
+        </w:r>
+        <w:r>
+          <w:instrText xml:space="preserve"> PAGE   \* MERGEFORMAT </w:instrText>
+        </w:r>
+        <w:r>
+          <w:fldChar w:fldCharType="separate"/>
+        </w:r>
+        <w:r>
+          <w:rPr>
+            <w:noProof/>
+          </w:rPr>
+          <w:t>2</w:t>
+        </w:r>
+        <w:r>
+          <w:rPr>
+            <w:noProof/>
+          </w:rPr>
+          <w:fldChar w:fldCharType="end"/>
+        </w:r>
+      </w:p>
+    </w:sdtContent>
+  </w:sdt>
+  <w:p>
+    <w:pPr>
+      <w:pStyle w:val="Footer"/>
+    </w:pPr>
+  </w:p>
+</w:ftr>
+</file>
+
+<file path=word/footer3.xml><?xml version="1.0" encoding="utf-8"?>
+<w:ftr xmlns:wpc="http://schemas.microsoft.com/office/word/2010/wordprocessingCanvas" xmlns:cx="http://schemas.microsoft.com/office/drawing/2014/chartex" xmlns:cx1="http://schemas.microsoft.com/office/drawing/2015/9/8/chartex" xmlns:cx2="http://schemas.microsoft.com/office/drawing/2015/10/21/chartex" xmlns:cx3="http://schemas.microsoft.com/office/drawing/2016/5/9/chartex" xmlns:cx4="http://schemas.microsoft.com/office/drawing/2016/5/10/chartex" xmlns:cx5="http://schemas.microsoft.com/office/drawing/2016/5/11/chartex" xmlns:cx6="http://schemas.microsoft.com/office/drawing/2016/5/12/chartex" xmlns:cx7="http://schemas.microsoft.com/office/drawing/2016/5/13/chartex" xmlns:cx8="http://schemas.microsoft.com/office/drawing/2016/5/14/chartex" xmlns:mc="http://schemas.openxmlformats.org/markup-compatibility/2006" xmlns:aink="http://schemas.microsoft.com/office/drawing/2016/ink" xmlns:am3d="http://schemas.microsoft.com/office/drawing/2017/model3d" xmlns:o="urn:schemas-microsoft-com:office:office" xmlns:oel="http://schemas.microsoft.com/office/2019/extlst" xmlns:r="http://schemas.openxmlformats.org/officeDocument/2006/relationships" xmlns:m="http://schemas.openxmlformats.org/officeDocument/2006/math" xmlns:v="urn:schemas-microsoft-com:vml" xmlns:wp14="http://schemas.microsoft.com/office/word/2010/wordprocessingDrawing" xmlns:wp="http://schemas.openxmlformats.org/drawingml/2006/wordprocessingDrawing" xmlns:w10="urn:schemas-microsoft-com:office:word" xmlns:w="http://schemas.openxmlformats.org/wordprocessingml/2006/main" xmlns:w14="http://schemas.microsoft.com/office/word/2010/wordml" xmlns:w15="http://schemas.microsoft.com/office/word/2012/wordml" xmlns:w16cex="http://schemas.microsoft.com/office/word/2018/wordml/cex" xmlns:w16cid="http://schemas.microsoft.com/office/word/2016/wordml/cid" xmlns:w16="http://schemas.microsoft.com/office/word/2018/wordml" xmlns:w16du="http://schemas.microsoft.com/office/word/2023/wordml/word16du" xmlns:w16sdtdh="http://schemas.microsoft.com/office/word/2020/wordml/sdtdatahash" xmlns:w16sdtfl="http://schemas.microsoft.com/office/word/2024/wordml/sdtformatlock" xmlns:w16se="http://schemas.microsoft.com/office/word/2015/wordml/symex" xmlns:wpg="http://schemas.microsoft.com/office/word/2010/wordprocessingGroup" xmlns:wpi="http://schemas.microsoft.com/office/word/2010/wordprocessingInk" xmlns:wne="http://schemas.microsoft.com/office/word/2006/wordml" xmlns:wps="http://schemas.microsoft.com/office/word/2010/wordprocessingShape" mc:Ignorable="w14 w15 w16se w16cid w16 w16cex w16sdtdh w16sdtfl w16du wp14">
+  <w:p>
+    <w:pPr>
+      <w:pStyle w:val="Footer"/>
+    </w:pPr>
+  </w:p>
+</w:ftr>
+</file>
+
 <file path=word/footnotes.xml><?xml version="1.0" encoding="utf-8"?>
 <w:footnotes xmlns:w="http://schemas.openxmlformats.org/wordprocessingml/2006/main" xmlns:m="http://schemas.openxmlformats.org/officeDocument/2006/math" xmlns:r="http://schemas.openxmlformats.org/officeDocument/2006/relationships" xmlns:o="urn:schemas-microsoft-com:office:office" xmlns:v="urn:schemas-microsoft-com:vml" xmlns:w10="urn:schemas-microsoft-com:office:word" xmlns:a="http://schemas.openxmlformats.org/drawingml/2006/main" xmlns:pic="http://schemas.openxmlformats.org/drawingml/2006/picture" xmlns:wp="http://schemas.openxmlformats.org/drawingml/2006/wordprocessingDrawing">
   <w:footnote w:type="continuationSeparator" w:id="0">
@@ -665,8 +1493,142 @@
 </w:footnotes>
 </file>
 
+<file path=word/header1.xml><?xml version="1.0" encoding="utf-8"?>
+<w:hdr xmlns:wpc="http://schemas.microsoft.com/office/word/2010/wordprocessingCanvas" xmlns:cx="http://schemas.microsoft.com/office/drawing/2014/chartex" xmlns:cx1="http://schemas.microsoft.com/office/drawing/2015/9/8/chartex" xmlns:cx2="http://schemas.microsoft.com/office/drawing/2015/10/21/chartex" xmlns:cx3="http://schemas.microsoft.com/office/drawing/2016/5/9/chartex" xmlns:cx4="http://schemas.microsoft.com/office/drawing/2016/5/10/chartex" xmlns:cx5="http://schemas.microsoft.com/office/drawing/2016/5/11/chartex" xmlns:cx6="http://schemas.microsoft.com/office/drawing/2016/5/12/chartex" xmlns:cx7="http://schemas.microsoft.com/office/drawing/2016/5/13/chartex" xmlns:cx8="http://schemas.microsoft.com/office/drawing/2016/5/14/chartex" xmlns:mc="http://schemas.openxmlformats.org/markup-compatibility/2006" xmlns:aink="http://schemas.microsoft.com/office/drawing/2016/ink" xmlns:am3d="http://schemas.microsoft.com/office/drawing/2017/model3d" xmlns:o="urn:schemas-microsoft-com:office:office" xmlns:oel="http://schemas.microsoft.com/office/2019/extlst" xmlns:r="http://schemas.openxmlformats.org/officeDocument/2006/relationships" xmlns:m="http://schemas.openxmlformats.org/officeDocument/2006/math" xmlns:v="urn:schemas-microsoft-com:vml" xmlns:wp14="http://schemas.microsoft.com/office/word/2010/wordprocessingDrawing" xmlns:wp="http://schemas.openxmlformats.org/drawingml/2006/wordprocessingDrawing" xmlns:w10="urn:schemas-microsoft-com:office:word" xmlns:w="http://schemas.openxmlformats.org/wordprocessingml/2006/main" xmlns:w14="http://schemas.microsoft.com/office/word/2010/wordml" xmlns:w15="http://schemas.microsoft.com/office/word/2012/wordml" xmlns:w16cex="http://schemas.microsoft.com/office/word/2018/wordml/cex" xmlns:w16cid="http://schemas.microsoft.com/office/word/2016/wordml/cid" xmlns:w16="http://schemas.microsoft.com/office/word/2018/wordml" xmlns:w16du="http://schemas.microsoft.com/office/word/2023/wordml/word16du" xmlns:w16sdtdh="http://schemas.microsoft.com/office/word/2020/wordml/sdtdatahash" xmlns:w16sdtfl="http://schemas.microsoft.com/office/word/2024/wordml/sdtformatlock" xmlns:w16se="http://schemas.microsoft.com/office/word/2015/wordml/symex" xmlns:wpg="http://schemas.microsoft.com/office/word/2010/wordprocessingGroup" xmlns:wpi="http://schemas.microsoft.com/office/word/2010/wordprocessingInk" xmlns:wne="http://schemas.microsoft.com/office/word/2006/wordml" xmlns:wps="http://schemas.microsoft.com/office/word/2010/wordprocessingShape" mc:Ignorable="w14 w15 w16se w16cid w16 w16cex w16sdtdh w16sdtfl w16du wp14">
+  <w:p>
+    <w:pPr>
+      <w:pStyle w:val="Header"/>
+    </w:pPr>
+  </w:p>
+</w:hdr>
+</file>
+
+<file path=word/header2.xml><?xml version="1.0" encoding="utf-8"?>
+<w:hdr xmlns:wpc="http://schemas.microsoft.com/office/word/2010/wordprocessingCanvas" xmlns:cx="http://schemas.microsoft.com/office/drawing/2014/chartex" xmlns:cx1="http://schemas.microsoft.com/office/drawing/2015/9/8/chartex" xmlns:cx2="http://schemas.microsoft.com/office/drawing/2015/10/21/chartex" xmlns:cx3="http://schemas.microsoft.com/office/drawing/2016/5/9/chartex" xmlns:cx4="http://schemas.microsoft.com/office/drawing/2016/5/10/chartex" xmlns:cx5="http://schemas.microsoft.com/office/drawing/2016/5/11/chartex" xmlns:cx6="http://schemas.microsoft.com/office/drawing/2016/5/12/chartex" xmlns:cx7="http://schemas.microsoft.com/office/drawing/2016/5/13/chartex" xmlns:cx8="http://schemas.microsoft.com/office/drawing/2016/5/14/chartex" xmlns:mc="http://schemas.openxmlformats.org/markup-compatibility/2006" xmlns:aink="http://schemas.microsoft.com/office/drawing/2016/ink" xmlns:am3d="http://schemas.microsoft.com/office/drawing/2017/model3d" xmlns:o="urn:schemas-microsoft-com:office:office" xmlns:oel="http://schemas.microsoft.com/office/2019/extlst" xmlns:r="http://schemas.openxmlformats.org/officeDocument/2006/relationships" xmlns:m="http://schemas.openxmlformats.org/officeDocument/2006/math" xmlns:v="urn:schemas-microsoft-com:vml" xmlns:wp14="http://schemas.microsoft.com/office/word/2010/wordprocessingDrawing" xmlns:wp="http://schemas.openxmlformats.org/drawingml/2006/wordprocessingDrawing" xmlns:w10="urn:schemas-microsoft-com:office:word" xmlns:w="http://schemas.openxmlformats.org/wordprocessingml/2006/main" xmlns:w14="http://schemas.microsoft.com/office/word/2010/wordml" xmlns:w15="http://schemas.microsoft.com/office/word/2012/wordml" xmlns:w16cex="http://schemas.microsoft.com/office/word/2018/wordml/cex" xmlns:w16cid="http://schemas.microsoft.com/office/word/2016/wordml/cid" xmlns:w16="http://schemas.microsoft.com/office/word/2018/wordml" xmlns:w16du="http://schemas.microsoft.com/office/word/2023/wordml/word16du" xmlns:w16sdtdh="http://schemas.microsoft.com/office/word/2020/wordml/sdtdatahash" xmlns:w16sdtfl="http://schemas.microsoft.com/office/word/2024/wordml/sdtformatlock" xmlns:w16se="http://schemas.microsoft.com/office/word/2015/wordml/symex" xmlns:wpg="http://schemas.microsoft.com/office/word/2010/wordprocessingGroup" xmlns:wpi="http://schemas.microsoft.com/office/word/2010/wordprocessingInk" xmlns:wne="http://schemas.microsoft.com/office/word/2006/wordml" xmlns:wps="http://schemas.microsoft.com/office/word/2010/wordprocessingShape" mc:Ignorable="w14 w15 w16se w16cid w16 w16cex w16sdtdh w16sdtfl w16du wp14">
+  <w:p>
+    <w:pPr>
+      <w:pStyle w:val="Header"/>
+    </w:pPr>
+  </w:p>
+</w:hdr>
+</file>
+
+<file path=word/header3.xml><?xml version="1.0" encoding="utf-8"?>
+<w:hdr xmlns:wpc="http://schemas.microsoft.com/office/word/2010/wordprocessingCanvas" xmlns:cx="http://schemas.microsoft.com/office/drawing/2014/chartex" xmlns:cx1="http://schemas.microsoft.com/office/drawing/2015/9/8/chartex" xmlns:cx2="http://schemas.microsoft.com/office/drawing/2015/10/21/chartex" xmlns:cx3="http://schemas.microsoft.com/office/drawing/2016/5/9/chartex" xmlns:cx4="http://schemas.microsoft.com/office/drawing/2016/5/10/chartex" xmlns:cx5="http://schemas.microsoft.com/office/drawing/2016/5/11/chartex" xmlns:cx6="http://schemas.microsoft.com/office/drawing/2016/5/12/chartex" xmlns:cx7="http://schemas.microsoft.com/office/drawing/2016/5/13/chartex" xmlns:cx8="http://schemas.microsoft.com/office/drawing/2016/5/14/chartex" xmlns:mc="http://schemas.openxmlformats.org/markup-compatibility/2006" xmlns:aink="http://schemas.microsoft.com/office/drawing/2016/ink" xmlns:am3d="http://schemas.microsoft.com/office/drawing/2017/model3d" xmlns:o="urn:schemas-microsoft-com:office:office" xmlns:oel="http://schemas.microsoft.com/office/2019/extlst" xmlns:r="http://schemas.openxmlformats.org/officeDocument/2006/relationships" xmlns:m="http://schemas.openxmlformats.org/officeDocument/2006/math" xmlns:v="urn:schemas-microsoft-com:vml" xmlns:wp14="http://schemas.microsoft.com/office/word/2010/wordprocessingDrawing" xmlns:wp="http://schemas.openxmlformats.org/drawingml/2006/wordprocessingDrawing" xmlns:w10="urn:schemas-microsoft-com:office:word" xmlns:w="http://schemas.openxmlformats.org/wordprocessingml/2006/main" xmlns:w14="http://schemas.microsoft.com/office/word/2010/wordml" xmlns:w15="http://schemas.microsoft.com/office/word/2012/wordml" xmlns:w16cex="http://schemas.microsoft.com/office/word/2018/wordml/cex" xmlns:w16cid="http://schemas.microsoft.com/office/word/2016/wordml/cid" xmlns:w16="http://schemas.microsoft.com/office/word/2018/wordml" xmlns:w16du="http://schemas.microsoft.com/office/word/2023/wordml/word16du" xmlns:w16sdtdh="http://schemas.microsoft.com/office/word/2020/wordml/sdtdatahash" xmlns:w16sdtfl="http://schemas.microsoft.com/office/word/2024/wordml/sdtformatlock" xmlns:w16se="http://schemas.microsoft.com/office/word/2015/wordml/symex" xmlns:wpg="http://schemas.microsoft.com/office/word/2010/wordprocessingGroup" xmlns:wpi="http://schemas.microsoft.com/office/word/2010/wordprocessingInk" xmlns:wne="http://schemas.microsoft.com/office/word/2006/wordml" xmlns:wps="http://schemas.microsoft.com/office/word/2010/wordprocessingShape" mc:Ignorable="w14 w15 w16se w16cid w16 w16cex w16sdtdh w16sdtfl w16du wp14">
+  <w:p>
+    <w:pPr>
+      <w:pStyle w:val="Header"/>
+    </w:pPr>
+  </w:p>
+</w:hdr>
+</file>
+
 <file path=word/numbering.xml><?xml version="1.0" encoding="utf-8"?>
-<w:numbering xmlns:w="http://schemas.openxmlformats.org/wordprocessingml/2006/main">
+<w:numbering xmlns:aink="http://schemas.microsoft.com/office/drawing/2016/ink" xmlns:am3d="http://schemas.microsoft.com/office/drawing/2017/model3d" xmlns:cx="http://schemas.microsoft.com/office/drawing/2014/chartex" xmlns:cx1="http://schemas.microsoft.com/office/drawing/2015/9/8/chartex" xmlns:cx2="http://schemas.microsoft.com/office/drawing/2015/10/21/chartex" xmlns:cx3="http://schemas.microsoft.com/office/drawing/2016/5/9/chartex" xmlns:cx4="http://schemas.microsoft.com/office/drawing/2016/5/10/chartex" xmlns:cx5="http://schemas.microsoft.com/office/drawing/2016/5/11/chartex" xmlns:cx6="http://schemas.microsoft.com/office/drawing/2016/5/12/chartex" xmlns:cx7="http://schemas.microsoft.com/office/drawing/2016/5/13/chartex" xmlns:cx8="http://schemas.microsoft.com/office/drawing/2016/5/14/chartex" xmlns:m="http://schemas.openxmlformats.org/officeDocument/2006/math" xmlns:mc="http://schemas.openxmlformats.org/markup-compatibility/2006" xmlns:o="urn:schemas-microsoft-com:office:office" xmlns:oel="http://schemas.microsoft.com/office/2019/extlst" xmlns:r="http://schemas.openxmlformats.org/officeDocument/2006/relationships" xmlns:v="urn:schemas-microsoft-com:vml" xmlns:w="http://schemas.openxmlformats.org/wordprocessingml/2006/main" xmlns:w10="urn:schemas-microsoft-com:office:word" xmlns:w14="http://schemas.microsoft.com/office/word/2010/wordml" xmlns:w15="http://schemas.microsoft.com/office/word/2012/wordml" xmlns:w16="http://schemas.microsoft.com/office/word/2018/wordml" xmlns:w16cex="http://schemas.microsoft.com/office/word/2018/wordml/cex" xmlns:w16cid="http://schemas.microsoft.com/office/word/2016/wordml/cid" xmlns:w16du="http://schemas.microsoft.com/office/word/2023/wordml/word16du" xmlns:w16sdtdh="http://schemas.microsoft.com/office/word/2020/wordml/sdtdatahash" xmlns:w16sdtfl="http://schemas.microsoft.com/office/word/2024/wordml/sdtformatlock" xmlns:w16se="http://schemas.microsoft.com/office/word/2015/wordml/symex" xmlns:wne="http://schemas.microsoft.com/office/word/2006/wordml" xmlns:wp="http://schemas.openxmlformats.org/drawingml/2006/wordprocessingDrawing" xmlns:wp14="http://schemas.microsoft.com/office/word/2010/wordprocessingDrawing" xmlns:wpc="http://schemas.microsoft.com/office/word/2010/wordprocessingCanvas" xmlns:wpg="http://schemas.microsoft.com/office/word/2010/wordprocessingGroup" xmlns:wpi="http://schemas.microsoft.com/office/word/2010/wordprocessingInk" xmlns:wps="http://schemas.microsoft.com/office/word/2010/wordprocessingShape" mc:Ignorable="w14 w15 w16se w16cid w16 w16cex w16sdtdh w16sdtfl w16du wp14">
+  <w:abstractNum w15:restartNumberingAfterBreak="0" w:abstractNumId="0">
+    <w:nsid w:val="170CD2DE"/>
+    <w:multiLevelType w:val="multilevel"/>
+    <w:tmpl w:val="FB72EDBA"/>
+    <w:lvl w:ilvl="0">
+      <w:numFmt w:val="bullet"/>
+      <w:lvlText w:val=" "/>
+      <w:lvlJc w:val="left"/>
+      <w:pPr>
+        <w:tabs>
+          <w:tab w:pos="0" w:val="num"/>
+        </w:tabs>
+        <w:ind w:hanging="480" w:left="480"/>
+      </w:pPr>
+    </w:lvl>
+    <w:lvl w:ilvl="1">
+      <w:numFmt w:val="bullet"/>
+      <w:lvlText w:val=" "/>
+      <w:lvlJc w:val="left"/>
+      <w:pPr>
+        <w:tabs>
+          <w:tab w:pos="720" w:val="num"/>
+        </w:tabs>
+        <w:ind w:hanging="480" w:left="1200"/>
+      </w:pPr>
+    </w:lvl>
+    <w:lvl w:ilvl="2">
+      <w:numFmt w:val="bullet"/>
+      <w:lvlText w:val=" "/>
+      <w:lvlJc w:val="left"/>
+      <w:pPr>
+        <w:tabs>
+          <w:tab w:pos="1440" w:val="num"/>
+        </w:tabs>
+        <w:ind w:hanging="480" w:left="1920"/>
+      </w:pPr>
+    </w:lvl>
+    <w:lvl w:ilvl="3">
+      <w:numFmt w:val="bullet"/>
+      <w:lvlText w:val=" "/>
+      <w:lvlJc w:val="left"/>
+      <w:pPr>
+        <w:tabs>
+          <w:tab w:pos="2160" w:val="num"/>
+        </w:tabs>
+        <w:ind w:hanging="480" w:left="2640"/>
+      </w:pPr>
+    </w:lvl>
+    <w:lvl w:ilvl="4">
+      <w:numFmt w:val="bullet"/>
+      <w:lvlText w:val=" "/>
+      <w:lvlJc w:val="left"/>
+      <w:pPr>
+        <w:tabs>
+          <w:tab w:pos="2880" w:val="num"/>
+        </w:tabs>
+        <w:ind w:hanging="480" w:left="3360"/>
+      </w:pPr>
+    </w:lvl>
+    <w:lvl w:ilvl="5">
+      <w:numFmt w:val="bullet"/>
+      <w:lvlText w:val=" "/>
+      <w:lvlJc w:val="left"/>
+      <w:pPr>
+        <w:tabs>
+          <w:tab w:pos="3600" w:val="num"/>
+        </w:tabs>
+        <w:ind w:hanging="480" w:left="4080"/>
+      </w:pPr>
+    </w:lvl>
+    <w:lvl w:ilvl="6">
+      <w:numFmt w:val="bullet"/>
+      <w:lvlText w:val=" "/>
+      <w:lvlJc w:val="left"/>
+      <w:pPr>
+        <w:tabs>
+          <w:tab w:pos="4320" w:val="num"/>
+        </w:tabs>
+        <w:ind w:hanging="480" w:left="4800"/>
+      </w:pPr>
+    </w:lvl>
+    <w:lvl w:ilvl="7">
+      <w:numFmt w:val="bullet"/>
+      <w:lvlText w:val=" "/>
+      <w:lvlJc w:val="left"/>
+      <w:pPr>
+        <w:tabs>
+          <w:tab w:pos="5040" w:val="num"/>
+        </w:tabs>
+        <w:ind w:hanging="480" w:left="5520"/>
+      </w:pPr>
+    </w:lvl>
+    <w:lvl w:ilvl="8">
+      <w:numFmt w:val="bullet"/>
+      <w:lvlText w:val=" "/>
+      <w:lvlJc w:val="left"/>
+      <w:pPr>
+        <w:tabs>
+          <w:tab w:pos="5760" w:val="num"/>
+        </w:tabs>
+        <w:ind w:hanging="480" w:left="6240"/>
+      </w:pPr>
+    </w:lvl>
+  </w:abstractNum>
   <w:abstractNum w:abstractNumId="990">
     <w:nsid w:val="0000A990"/>
     <w:multiLevelType w:val="multilevel"/>
@@ -743,6 +1705,9 @@
       </w:pPr>
     </w:lvl>
   </w:abstractNum>
+  <w:num w16cid:durableId="125778032" w:numId="1">
+    <w:abstractNumId w:val="0"/>
+  </w:num>
   <w:num w:numId="1000">
     <w:abstractNumId w:val="990"/>
   </w:num>
@@ -750,7 +1715,7 @@
 </file>
 
 <file path=word/styles.xml><?xml version="1.0" encoding="utf-8"?>
-<w:styles xmlns:r="http://schemas.openxmlformats.org/officeDocument/2006/relationships" xmlns:w="http://schemas.openxmlformats.org/wordprocessingml/2006/main">
+<w:styles xmlns:mc="http://schemas.openxmlformats.org/markup-compatibility/2006" xmlns:r="http://schemas.openxmlformats.org/officeDocument/2006/relationships" xmlns:w="http://schemas.openxmlformats.org/wordprocessingml/2006/main" xmlns:w14="http://schemas.microsoft.com/office/word/2010/wordml" xmlns:w15="http://schemas.microsoft.com/office/word/2012/wordml" xmlns:w16="http://schemas.microsoft.com/office/word/2018/wordml" xmlns:w16cex="http://schemas.microsoft.com/office/word/2018/wordml/cex" xmlns:w16cid="http://schemas.microsoft.com/office/word/2016/wordml/cid" xmlns:w16du="http://schemas.microsoft.com/office/word/2023/wordml/word16du" xmlns:w16sdtdh="http://schemas.microsoft.com/office/word/2020/wordml/sdtdatahash" xmlns:w16sdtfl="http://schemas.microsoft.com/office/word/2024/wordml/sdtformatlock" xmlns:w16se="http://schemas.microsoft.com/office/word/2015/wordml/symex" mc:Ignorable="w14 w15 w16se w16cid w16 w16cex w16sdtdh w16sdtfl w16du">
   <w:docDefaults>
     <w:rPrDefault>
       <w:rPr>
@@ -766,166 +1731,254 @@
       </w:pPr>
     </w:pPrDefault>
   </w:docDefaults>
-  <w:latentStyles w:count="276" w:defLockedState="0" w:defQFormat="0" w:defSemiHidden="0" w:defUIPriority="0" w:defUnhideWhenUsed="0"/>
+  <w:latentStyles w:count="376" w:defLockedState="0" w:defQFormat="0" w:defSemiHidden="0" w:defUIPriority="0" w:defUnhideWhenUsed="0">
+    <w:lsdException w:name="footer" w:uiPriority="99"/>
+    <w:lsdException w:name="Normal Table" w:semiHidden="1" w:unhideWhenUsed="1"/>
+    <w:lsdException w:name="Table Simple 1" w:semiHidden="1" w:unhideWhenUsed="1"/>
+    <w:lsdException w:name="Table Simple 2" w:semiHidden="1" w:unhideWhenUsed="1"/>
+    <w:lsdException w:name="Table Simple 3" w:semiHidden="1" w:unhideWhenUsed="1"/>
+    <w:lsdException w:name="Table Classic 1" w:semiHidden="1" w:unhideWhenUsed="1"/>
+    <w:lsdException w:name="Table Classic 2" w:semiHidden="1" w:unhideWhenUsed="1"/>
+    <w:lsdException w:name="Table Classic 3" w:semiHidden="1" w:unhideWhenUsed="1"/>
+    <w:lsdException w:name="Table Classic 4" w:semiHidden="1" w:unhideWhenUsed="1"/>
+    <w:lsdException w:name="Table Colorful 1" w:semiHidden="1" w:unhideWhenUsed="1"/>
+    <w:lsdException w:name="Table Colorful 2" w:semiHidden="1" w:unhideWhenUsed="1"/>
+    <w:lsdException w:name="Table Colorful 3" w:semiHidden="1" w:unhideWhenUsed="1"/>
+    <w:lsdException w:name="Table Columns 1" w:semiHidden="1" w:unhideWhenUsed="1"/>
+    <w:lsdException w:name="Table Columns 2" w:semiHidden="1" w:unhideWhenUsed="1"/>
+    <w:lsdException w:name="Table Columns 3" w:semiHidden="1" w:unhideWhenUsed="1"/>
+    <w:lsdException w:name="Table Columns 4" w:semiHidden="1" w:unhideWhenUsed="1"/>
+    <w:lsdException w:name="Table Columns 5" w:semiHidden="1" w:unhideWhenUsed="1"/>
+    <w:lsdException w:name="Table Grid 1" w:semiHidden="1" w:unhideWhenUsed="1"/>
+    <w:lsdException w:name="Table Grid 2" w:semiHidden="1" w:unhideWhenUsed="1"/>
+    <w:lsdException w:name="Table Grid 3" w:semiHidden="1" w:unhideWhenUsed="1"/>
+    <w:lsdException w:name="Table Grid 4" w:semiHidden="1" w:unhideWhenUsed="1"/>
+    <w:lsdException w:name="Table Grid 5" w:semiHidden="1" w:unhideWhenUsed="1"/>
+    <w:lsdException w:name="Table Grid 6" w:semiHidden="1" w:unhideWhenUsed="1"/>
+    <w:lsdException w:name="Table Grid 7" w:semiHidden="1" w:unhideWhenUsed="1"/>
+    <w:lsdException w:name="Table Grid 8" w:semiHidden="1" w:unhideWhenUsed="1"/>
+    <w:lsdException w:name="Table List 1" w:semiHidden="1" w:unhideWhenUsed="1"/>
+    <w:lsdException w:name="Table List 2" w:semiHidden="1" w:unhideWhenUsed="1"/>
+    <w:lsdException w:name="Table List 3" w:semiHidden="1" w:unhideWhenUsed="1"/>
+    <w:lsdException w:name="Table List 4" w:semiHidden="1" w:unhideWhenUsed="1"/>
+    <w:lsdException w:name="Table List 5" w:semiHidden="1" w:unhideWhenUsed="1"/>
+    <w:lsdException w:name="Table List 6" w:semiHidden="1" w:unhideWhenUsed="1"/>
+    <w:lsdException w:name="Table List 7" w:semiHidden="1" w:unhideWhenUsed="1"/>
+    <w:lsdException w:name="Table List 8" w:semiHidden="1" w:unhideWhenUsed="1"/>
+    <w:lsdException w:name="Table 3D effects 1" w:semiHidden="1" w:unhideWhenUsed="1"/>
+    <w:lsdException w:name="Table 3D effects 2" w:semiHidden="1" w:unhideWhenUsed="1"/>
+    <w:lsdException w:name="Table 3D effects 3" w:semiHidden="1" w:unhideWhenUsed="1"/>
+    <w:lsdException w:name="Table Contemporary" w:semiHidden="1" w:unhideWhenUsed="1"/>
+    <w:lsdException w:name="Table Elegant" w:semiHidden="1" w:unhideWhenUsed="1"/>
+    <w:lsdException w:name="Table Professional" w:semiHidden="1" w:unhideWhenUsed="1"/>
+    <w:lsdException w:name="Table Subtle 1" w:semiHidden="1" w:unhideWhenUsed="1"/>
+    <w:lsdException w:name="Table Subtle 2" w:semiHidden="1" w:unhideWhenUsed="1"/>
+    <w:lsdException w:name="Table Web 1" w:semiHidden="1" w:unhideWhenUsed="1"/>
+    <w:lsdException w:name="Table Web 2" w:semiHidden="1" w:unhideWhenUsed="1"/>
+    <w:lsdException w:name="Table Web 3" w:semiHidden="1" w:unhideWhenUsed="1"/>
+    <w:lsdException w:name="Table Theme" w:semiHidden="1" w:unhideWhenUsed="1"/>
+    <w:lsdException w:name="Light Shading"/>
+    <w:lsdException w:name="Light List"/>
+    <w:lsdException w:name="Light Grid"/>
+    <w:lsdException w:name="Medium Shading 1"/>
+    <w:lsdException w:name="Medium Shading 2"/>
+    <w:lsdException w:name="Medium List 1"/>
+    <w:lsdException w:name="Medium List 2"/>
+    <w:lsdException w:name="Medium Grid 1"/>
+    <w:lsdException w:name="Medium Grid 2"/>
+    <w:lsdException w:name="Medium Grid 3"/>
+    <w:lsdException w:name="Dark List"/>
+    <w:lsdException w:name="Colorful Shading"/>
+    <w:lsdException w:name="Colorful List"/>
+    <w:lsdException w:name="Colorful Grid"/>
+    <w:lsdException w:name="Light Shading Accent 1"/>
+    <w:lsdException w:name="Light List Accent 1"/>
+    <w:lsdException w:name="Light Grid Accent 1"/>
+    <w:lsdException w:name="Medium Shading 1 Accent 1"/>
+    <w:lsdException w:name="Medium Shading 2 Accent 1"/>
+    <w:lsdException w:name="Medium List 1 Accent 1"/>
+    <w:lsdException w:name="Medium List 2 Accent 1"/>
+    <w:lsdException w:name="Medium Grid 1 Accent 1"/>
+    <w:lsdException w:name="Medium Grid 2 Accent 1"/>
+    <w:lsdException w:name="Medium Grid 3 Accent 1"/>
+    <w:lsdException w:name="Dark List Accent 1"/>
+    <w:lsdException w:name="Colorful Shading Accent 1"/>
+    <w:lsdException w:name="Colorful List Accent 1"/>
+    <w:lsdException w:name="Colorful Grid Accent 1"/>
+    <w:lsdException w:name="Light Shading Accent 2"/>
+    <w:lsdException w:name="Light List Accent 2"/>
+    <w:lsdException w:name="Light Grid Accent 2"/>
+    <w:lsdException w:name="Medium Shading 1 Accent 2"/>
+    <w:lsdException w:name="Medium Shading 2 Accent 2"/>
+    <w:lsdException w:name="Medium List 1 Accent 2"/>
+    <w:lsdException w:name="Medium List 2 Accent 2"/>
+    <w:lsdException w:name="Medium Grid 1 Accent 2"/>
+    <w:lsdException w:name="Medium Grid 2 Accent 2"/>
+    <w:lsdException w:name="Medium Grid 3 Accent 2"/>
+    <w:lsdException w:name="Dark List Accent 2"/>
+    <w:lsdException w:name="Colorful Shading Accent 2"/>
+    <w:lsdException w:name="Colorful List Accent 2"/>
+    <w:lsdException w:name="Colorful Grid Accent 2"/>
+    <w:lsdException w:name="Light Shading Accent 3"/>
+    <w:lsdException w:name="Light List Accent 3"/>
+    <w:lsdException w:name="Light Grid Accent 3"/>
+    <w:lsdException w:name="Medium Shading 1 Accent 3"/>
+    <w:lsdException w:name="Medium Shading 2 Accent 3"/>
+    <w:lsdException w:name="Medium List 1 Accent 3"/>
+    <w:lsdException w:name="Medium List 2 Accent 3"/>
+    <w:lsdException w:name="Medium Grid 1 Accent 3"/>
+    <w:lsdException w:name="Medium Grid 2 Accent 3"/>
+    <w:lsdException w:name="Medium Grid 3 Accent 3"/>
+    <w:lsdException w:name="Dark List Accent 3"/>
+    <w:lsdException w:name="Colorful Shading Accent 3"/>
+    <w:lsdException w:name="Colorful List Accent 3"/>
+    <w:lsdException w:name="Colorful Grid Accent 3"/>
+    <w:lsdException w:name="Light Shading Accent 4"/>
+    <w:lsdException w:name="Light List Accent 4"/>
+    <w:lsdException w:name="Light Grid Accent 4"/>
+    <w:lsdException w:name="Medium Shading 1 Accent 4"/>
+    <w:lsdException w:name="Medium Shading 2 Accent 4"/>
+    <w:lsdException w:name="Medium List 1 Accent 4"/>
+    <w:lsdException w:name="Medium List 2 Accent 4"/>
+    <w:lsdException w:name="Medium Grid 1 Accent 4"/>
+    <w:lsdException w:name="Medium Grid 2 Accent 4"/>
+    <w:lsdException w:name="Medium Grid 3 Accent 4"/>
+    <w:lsdException w:name="Dark List Accent 4"/>
+    <w:lsdException w:name="Colorful Shading Accent 4"/>
+    <w:lsdException w:name="Colorful List Accent 4"/>
+    <w:lsdException w:name="Colorful Grid Accent 4"/>
+    <w:lsdException w:name="Light Shading Accent 5"/>
+    <w:lsdException w:name="Light List Accent 5"/>
+    <w:lsdException w:name="Light Grid Accent 5"/>
+    <w:lsdException w:name="Medium Shading 1 Accent 5"/>
+    <w:lsdException w:name="Medium Shading 2 Accent 5"/>
+    <w:lsdException w:name="Medium List 1 Accent 5"/>
+    <w:lsdException w:name="Medium List 2 Accent 5"/>
+    <w:lsdException w:name="Medium Grid 1 Accent 5"/>
+    <w:lsdException w:name="Medium Grid 2 Accent 5"/>
+    <w:lsdException w:name="Medium Grid 3 Accent 5"/>
+    <w:lsdException w:name="Dark List Accent 5"/>
+    <w:lsdException w:name="Colorful Shading Accent 5"/>
+    <w:lsdException w:name="Colorful List Accent 5"/>
+    <w:lsdException w:name="Colorful Grid Accent 5"/>
+    <w:lsdException w:name="Light Shading Accent 6"/>
+    <w:lsdException w:name="Light List Accent 6"/>
+    <w:lsdException w:name="Light Grid Accent 6"/>
+    <w:lsdException w:name="Medium Shading 1 Accent 6"/>
+    <w:lsdException w:name="Medium Shading 2 Accent 6"/>
+    <w:lsdException w:name="Medium List 1 Accent 6"/>
+    <w:lsdException w:name="Medium List 2 Accent 6"/>
+    <w:lsdException w:name="Medium Grid 1 Accent 6"/>
+    <w:lsdException w:name="Medium Grid 2 Accent 6"/>
+    <w:lsdException w:name="Medium Grid 3 Accent 6"/>
+    <w:lsdException w:name="Dark List Accent 6"/>
+    <w:lsdException w:name="Colorful Shading Accent 6"/>
+    <w:lsdException w:name="Colorful List Accent 6"/>
+    <w:lsdException w:name="Colorful Grid Accent 6"/>
+    <w:lsdException w:name="Grid Table 4" w:uiPriority="49"/>
+    <w:lsdException w:name="Grid Table 5 Dark" w:uiPriority="50"/>
+    <w:lsdException w:name="Grid Table 6 Colorful" w:uiPriority="51"/>
+    <w:lsdException w:name="Grid Table 7 Colorful" w:uiPriority="52"/>
+    <w:lsdException w:name="Grid Table 1 Light Accent 1" w:uiPriority="46"/>
+    <w:lsdException w:name="Grid Table 2 Accent 1" w:uiPriority="47"/>
+    <w:lsdException w:name="Grid Table 3 Accent 1" w:uiPriority="48"/>
+    <w:lsdException w:name="Grid Table 4 Accent 1" w:uiPriority="49"/>
+    <w:lsdException w:name="Grid Table 5 Dark Accent 1" w:uiPriority="50"/>
+    <w:lsdException w:name="Grid Table 6 Colorful Accent 1" w:uiPriority="51"/>
+    <w:lsdException w:name="Grid Table 7 Colorful Accent 1" w:uiPriority="52"/>
+    <w:lsdException w:name="Grid Table 1 Light Accent 2" w:uiPriority="46"/>
+    <w:lsdException w:name="Grid Table 2 Accent 2" w:uiPriority="47"/>
+    <w:lsdException w:name="Grid Table 3 Accent 2" w:uiPriority="48"/>
+    <w:lsdException w:name="Grid Table 4 Accent 2" w:uiPriority="49"/>
+    <w:lsdException w:name="Grid Table 5 Dark Accent 2" w:uiPriority="50"/>
+    <w:lsdException w:name="Grid Table 6 Colorful Accent 2" w:uiPriority="51"/>
+    <w:lsdException w:name="Grid Table 7 Colorful Accent 2" w:uiPriority="52"/>
+    <w:lsdException w:name="Grid Table 1 Light Accent 3" w:uiPriority="46"/>
+    <w:lsdException w:name="Grid Table 2 Accent 3" w:uiPriority="47"/>
+    <w:lsdException w:name="Grid Table 3 Accent 3" w:uiPriority="48"/>
+    <w:lsdException w:name="Grid Table 4 Accent 3" w:uiPriority="49"/>
+    <w:lsdException w:name="Grid Table 5 Dark Accent 3" w:uiPriority="50"/>
+    <w:lsdException w:name="Grid Table 6 Colorful Accent 3" w:uiPriority="51"/>
+    <w:lsdException w:name="Grid Table 7 Colorful Accent 3" w:uiPriority="52"/>
+    <w:lsdException w:name="Grid Table 1 Light Accent 4" w:uiPriority="46"/>
+    <w:lsdException w:name="Grid Table 2 Accent 4" w:uiPriority="47"/>
+    <w:lsdException w:name="Grid Table 3 Accent 4" w:uiPriority="48"/>
+    <w:lsdException w:name="Grid Table 4 Accent 4" w:uiPriority="49"/>
+    <w:lsdException w:name="Grid Table 5 Dark Accent 4" w:uiPriority="50"/>
+    <w:lsdException w:name="Grid Table 6 Colorful Accent 4" w:uiPriority="51"/>
+    <w:lsdException w:name="Grid Table 7 Colorful Accent 4" w:uiPriority="52"/>
+    <w:lsdException w:name="Grid Table 1 Light Accent 5" w:uiPriority="46"/>
+    <w:lsdException w:name="Grid Table 2 Accent 5" w:uiPriority="47"/>
+    <w:lsdException w:name="Grid Table 3 Accent 5" w:uiPriority="48"/>
+    <w:lsdException w:name="Grid Table 4 Accent 5" w:uiPriority="49"/>
+    <w:lsdException w:name="Grid Table 5 Dark Accent 5" w:uiPriority="50"/>
+    <w:lsdException w:name="Grid Table 6 Colorful Accent 5" w:uiPriority="51"/>
+    <w:lsdException w:name="Grid Table 7 Colorful Accent 5" w:uiPriority="52"/>
+    <w:lsdException w:name="Grid Table 1 Light Accent 6" w:uiPriority="46"/>
+    <w:lsdException w:name="Grid Table 2 Accent 6" w:uiPriority="47"/>
+    <w:lsdException w:name="Grid Table 3 Accent 6" w:uiPriority="48"/>
+    <w:lsdException w:name="Grid Table 4 Accent 6" w:uiPriority="49"/>
+    <w:lsdException w:name="Grid Table 5 Dark Accent 6" w:uiPriority="50"/>
+    <w:lsdException w:name="Grid Table 6 Colorful Accent 6" w:uiPriority="51"/>
+    <w:lsdException w:name="Grid Table 7 Colorful Accent 6" w:uiPriority="52"/>
+    <w:lsdException w:name="List Table 1 Light" w:uiPriority="46"/>
+    <w:lsdException w:name="List Table 2" w:uiPriority="47"/>
+    <w:lsdException w:name="List Table 3" w:uiPriority="48"/>
+    <w:lsdException w:name="List Table 4" w:uiPriority="49"/>
+    <w:lsdException w:name="List Table 5 Dark" w:uiPriority="50"/>
+    <w:lsdException w:name="List Table 6 Colorful" w:uiPriority="51"/>
+    <w:lsdException w:name="List Table 7 Colorful" w:uiPriority="52"/>
+    <w:lsdException w:name="List Table 1 Light Accent 1" w:uiPriority="46"/>
+    <w:lsdException w:name="List Table 2 Accent 1" w:uiPriority="47"/>
+    <w:lsdException w:name="List Table 3 Accent 1" w:uiPriority="48"/>
+    <w:lsdException w:name="List Table 4 Accent 1" w:uiPriority="49"/>
+    <w:lsdException w:name="List Table 5 Dark Accent 1" w:uiPriority="50"/>
+    <w:lsdException w:name="List Table 6 Colorful Accent 1" w:uiPriority="51"/>
+    <w:lsdException w:name="List Table 7 Colorful Accent 1" w:uiPriority="52"/>
+    <w:lsdException w:name="List Table 1 Light Accent 2" w:uiPriority="46"/>
+    <w:lsdException w:name="List Table 2 Accent 2" w:uiPriority="47"/>
+    <w:lsdException w:name="List Table 3 Accent 2" w:uiPriority="48"/>
+    <w:lsdException w:name="List Table 4 Accent 2" w:uiPriority="49"/>
+    <w:lsdException w:name="List Table 5 Dark Accent 2" w:uiPriority="50"/>
+    <w:lsdException w:name="List Table 6 Colorful Accent 2" w:uiPriority="51"/>
+    <w:lsdException w:name="List Table 7 Colorful Accent 2" w:uiPriority="52"/>
+    <w:lsdException w:name="List Table 1 Light Accent 3" w:uiPriority="46"/>
+    <w:lsdException w:name="List Table 2 Accent 3" w:uiPriority="47"/>
+    <w:lsdException w:name="List Table 3 Accent 3" w:uiPriority="48"/>
+    <w:lsdException w:name="List Table 4 Accent 3" w:uiPriority="49"/>
+    <w:lsdException w:name="List Table 5 Dark Accent 3" w:uiPriority="50"/>
+    <w:lsdException w:name="List Table 6 Colorful Accent 3" w:uiPriority="51"/>
+    <w:lsdException w:name="List Table 7 Colorful Accent 3" w:uiPriority="52"/>
+    <w:lsdException w:name="List Table 1 Light Accent 4" w:uiPriority="46"/>
+    <w:lsdException w:name="List Table 2 Accent 4" w:uiPriority="47"/>
+    <w:lsdException w:name="List Table 3 Accent 4" w:uiPriority="48"/>
+    <w:lsdException w:name="List Table 4 Accent 4" w:uiPriority="49"/>
+    <w:lsdException w:name="List Table 5 Dark Accent 4" w:uiPriority="50"/>
+    <w:lsdException w:name="List Table 6 Colorful Accent 4" w:uiPriority="51"/>
+    <w:lsdException w:name="List Table 7 Colorful Accent 4" w:uiPriority="52"/>
+    <w:lsdException w:name="List Table 1 Light Accent 5" w:uiPriority="46"/>
+    <w:lsdException w:name="List Table 2 Accent 5" w:uiPriority="47"/>
+    <w:lsdException w:name="List Table 3 Accent 5" w:uiPriority="48"/>
+    <w:lsdException w:name="List Table 4 Accent 5" w:uiPriority="49"/>
+    <w:lsdException w:name="List Table 5 Dark Accent 5" w:uiPriority="50"/>
+    <w:lsdException w:name="List Table 6 Colorful Accent 5" w:uiPriority="51"/>
+    <w:lsdException w:name="List Table 7 Colorful Accent 5" w:uiPriority="52"/>
+    <w:lsdException w:name="List Table 1 Light Accent 6" w:uiPriority="46"/>
+    <w:lsdException w:name="List Table 2 Accent 6" w:uiPriority="47"/>
+    <w:lsdException w:name="List Table 3 Accent 6" w:uiPriority="48"/>
+    <w:lsdException w:name="List Table 4 Accent 6" w:uiPriority="49"/>
+    <w:lsdException w:name="List Table 5 Dark Accent 6" w:uiPriority="50"/>
+    <w:lsdException w:name="List Table 6 Colorful Accent 6" w:uiPriority="51"/>
+    <w:lsdException w:name="List Table 7 Colorful Accent 6" w:uiPriority="52"/>
+    <w:lsdException w:name="Mention" w:semiHidden="1" w:uiPriority="99" w:unhideWhenUsed="1"/>
+    <w:lsdException w:name="Smart Hyperlink" w:semiHidden="1" w:uiPriority="99" w:unhideWhenUsed="1"/>
+    <w:lsdException w:name="Hashtag" w:semiHidden="1" w:uiPriority="99" w:unhideWhenUsed="1"/>
+    <w:lsdException w:name="Unresolved Mention" w:semiHidden="1" w:uiPriority="99" w:unhideWhenUsed="1"/>
+    <w:lsdException w:name="Smart Link" w:semiHidden="1" w:uiPriority="99" w:unhideWhenUsed="1"/>
+  </w:latentStyles>
   <w:style w:default="1" w:styleId="Normal" w:type="paragraph">
     <w:name w:val="Normal"/>
     <w:qFormat/>
-  </w:style>
-  <w:style w:styleId="BodyText" w:type="paragraph">
-    <w:name w:val="Body Text"/>
-    <w:basedOn w:val="Normal"/>
-    <w:link w:val="BodyTextChar"/>
-    <w:qFormat/>
-    <w:pPr>
-      <w:spacing w:after="180" w:before="180"/>
-    </w:pPr>
-  </w:style>
-  <w:style w:customStyle="1" w:styleId="FirstParagraph" w:type="paragraph">
-    <w:name w:val="First Paragraph"/>
-    <w:basedOn w:val="BodyText"/>
-    <w:next w:val="BodyText"/>
-    <w:qFormat/>
-  </w:style>
-  <w:style w:customStyle="1" w:styleId="Compact" w:type="paragraph">
-    <w:name w:val="Compact"/>
-    <w:basedOn w:val="BodyText"/>
-    <w:qFormat/>
-    <w:pPr>
-      <w:spacing w:after="36" w:before="36"/>
-    </w:pPr>
-  </w:style>
-  <w:style w:styleId="Title" w:type="paragraph">
-    <w:name w:val="Title"/>
-    <w:basedOn w:val="Normal"/>
-    <w:next w:val="BodyText"/>
-    <w:link w:val="TitleChar"/>
-    <w:uiPriority w:val="10"/>
-    <w:qFormat/>
-    <w:rsid w:val="00A10FD9"/>
-    <w:pPr>
-      <w:spacing w:after="80" w:line="240" w:lineRule="auto"/>
-      <w:contextualSpacing/>
-      <w:jc w:val="center"/>
-    </w:pPr>
-    <w:rPr>
-      <w:rFonts w:asciiTheme="majorHAnsi" w:cstheme="majorBidi" w:eastAsiaTheme="majorEastAsia" w:hAnsiTheme="majorHAnsi"/>
-      <w:sz w:val="56"/>
-      <w:szCs w:val="56"/>
-    </w:rPr>
-  </w:style>
-  <w:style w:customStyle="1" w:styleId="TitleChar" w:type="character">
-    <w:name w:val="Title Char"/>
-    <w:basedOn w:val="DefaultParagraphFont"/>
-    <w:link w:val="Title"/>
-    <w:uiPriority w:val="10"/>
-    <w:rsid w:val="00A10FD9"/>
-    <w:rPr>
-      <w:rFonts w:asciiTheme="majorHAnsi" w:cstheme="majorBidi" w:eastAsiaTheme="majorEastAsia" w:hAnsiTheme="majorHAnsi"/>
-      <w:sz w:val="56"/>
-      <w:szCs w:val="56"/>
-    </w:rPr>
-  </w:style>
-  <w:style w:styleId="Subtitle" w:type="paragraph">
-    <w:name w:val="Subtitle"/>
-    <w:basedOn w:val="Title"/>
-    <w:next w:val="BodyText"/>
-    <w:link w:val="SubtitleChar"/>
-    <w:uiPriority w:val="11"/>
-    <w:qFormat/>
-    <w:rsid w:val="00A10FD9"/>
-    <w:pPr>
-      <w:numPr>
-        <w:ilvl w:val="1"/>
-      </w:numPr>
-    </w:pPr>
-    <w:rPr>
-      <w:rFonts w:cstheme="majorBidi" w:eastAsiaTheme="majorEastAsia"/>
-      <w:spacing w:val="15"/>
-      <w:sz w:val="28"/>
-      <w:szCs w:val="28"/>
-    </w:rPr>
-  </w:style>
-  <w:style w:customStyle="1" w:styleId="SubtitleChar" w:type="character">
-    <w:name w:val="Subtitle Char"/>
-    <w:basedOn w:val="DefaultParagraphFont"/>
-    <w:link w:val="Subtitle"/>
-    <w:uiPriority w:val="11"/>
-    <w:rsid w:val="00A10FD9"/>
-    <w:rPr>
-      <w:rFonts w:cstheme="majorBidi" w:eastAsiaTheme="majorEastAsia"/>
-      <w:color w:themeColor="text1" w:themeTint="A6" w:val="595959"/>
-      <w:spacing w:val="15"/>
-      <w:sz w:val="28"/>
-      <w:szCs w:val="28"/>
-    </w:rPr>
-  </w:style>
-  <w:style w:customStyle="1" w:styleId="Author" w:type="paragraph">
-    <w:name w:val="Author"/>
-    <w:basedOn w:val="Title"/>
-    <w:next w:val="BodyText"/>
-    <w:qFormat/>
-    <w:pPr>
-      <w:keepNext/>
-      <w:keepLines/>
-    </w:pPr>
-    <w:rPr>
-      <w:sz w:val="24"/>
-      <w:szCs w:val="24"/>
-    </w:rPr>
-  </w:style>
-  <w:style w:styleId="Date" w:type="paragraph">
-    <w:name w:val="Date"/>
-    <w:basedOn w:val="Title"/>
-    <w:next w:val="BodyText"/>
-    <w:qFormat/>
-    <w:pPr>
-      <w:keepNext/>
-      <w:keepLines/>
-    </w:pPr>
-    <w:rPr>
-      <w:sz w:val="24"/>
-      <w:szCs w:val="24"/>
-    </w:rPr>
-  </w:style>
-  <w:style w:customStyle="1" w:styleId="AbstractTitle" w:type="paragraph">
-    <w:name w:val="Abstract Title"/>
-    <w:basedOn w:val="Normal"/>
-    <w:next w:val="Abstract"/>
-    <w:qFormat/>
-    <w:pPr>
-      <w:keepNext/>
-      <w:keepLines/>
-      <w:spacing w:after="0" w:before="300"/>
-      <w:jc w:val="center"/>
-    </w:pPr>
-    <w:rPr>
-      <w:b/>
-      <w:sz w:val="20"/>
-      <w:szCs w:val="20"/>
-    </w:rPr>
-  </w:style>
-  <w:style w:customStyle="1" w:styleId="Abstract" w:type="paragraph">
-    <w:name w:val="Abstract"/>
-    <w:basedOn w:val="Normal"/>
-    <w:next w:val="BodyText"/>
-    <w:qFormat/>
-    <w:pPr>
-      <w:keepNext/>
-      <w:keepLines/>
-      <w:spacing w:after="300" w:before="100"/>
-    </w:pPr>
-    <w:rPr>
-      <w:sz w:val="20"/>
-      <w:szCs w:val="20"/>
-    </w:rPr>
-  </w:style>
-  <w:style w:styleId="Bibliography" w:type="paragraph">
-    <w:name w:val="Bibliography"/>
-    <w:basedOn w:val="Normal"/>
-    <w:next w:val="Bibliography"/>
-    <w:qFormat/>
-    <w:pPr/>
-    <w:rPr/>
   </w:style>
   <w:style w:styleId="Heading1" w:type="paragraph">
     <w:name w:val="heading 1"/>
@@ -1126,6 +2179,184 @@
       <w:color w:themeColor="text1" w:themeTint="D8" w:val="272727"/>
     </w:rPr>
   </w:style>
+  <w:style w:default="1" w:styleId="DefaultParagraphFont" w:type="character">
+    <w:name w:val="Default Paragraph Font"/>
+    <w:uiPriority w:val="1"/>
+    <w:semiHidden/>
+    <w:unhideWhenUsed/>
+  </w:style>
+  <w:style w:default="1" w:styleId="TableNormal" w:type="table">
+    <w:name w:val="Normal Table"/>
+    <w:uiPriority w:val="99"/>
+    <w:semiHidden/>
+    <w:unhideWhenUsed/>
+    <w:tblPr>
+      <w:tblInd w:type="dxa" w:w="0"/>
+      <w:tblCellMar>
+        <w:top w:type="dxa" w:w="0"/>
+        <w:left w:type="dxa" w:w="108"/>
+        <w:bottom w:type="dxa" w:w="0"/>
+        <w:right w:type="dxa" w:w="108"/>
+      </w:tblCellMar>
+    </w:tblPr>
+  </w:style>
+  <w:style w:default="1" w:styleId="NoList" w:type="numbering">
+    <w:name w:val="No List"/>
+    <w:uiPriority w:val="99"/>
+    <w:semiHidden/>
+    <w:unhideWhenUsed/>
+  </w:style>
+  <w:style w:styleId="BodyText" w:type="paragraph">
+    <w:name w:val="Body Text"/>
+    <w:basedOn w:val="Normal"/>
+    <w:qFormat/>
+    <w:pPr>
+      <w:spacing w:after="180" w:before="180"/>
+    </w:pPr>
+  </w:style>
+  <w:style w:customStyle="1" w:styleId="FirstParagraph" w:type="paragraph">
+    <w:name w:val="First Paragraph"/>
+    <w:basedOn w:val="BodyText"/>
+    <w:next w:val="BodyText"/>
+    <w:qFormat/>
+  </w:style>
+  <w:style w:customStyle="1" w:styleId="Compact" w:type="paragraph">
+    <w:name w:val="Compact"/>
+    <w:basedOn w:val="BodyText"/>
+    <w:qFormat/>
+    <w:pPr>
+      <w:spacing w:after="36" w:before="36"/>
+    </w:pPr>
+  </w:style>
+  <w:style w:styleId="Title" w:type="paragraph">
+    <w:name w:val="Title"/>
+    <w:basedOn w:val="Normal"/>
+    <w:next w:val="BodyText"/>
+    <w:link w:val="TitleChar"/>
+    <w:uiPriority w:val="10"/>
+    <w:qFormat/>
+    <w:rsid w:val="00A10FD9"/>
+    <w:pPr>
+      <w:spacing w:after="80"/>
+      <w:contextualSpacing/>
+      <w:jc w:val="center"/>
+    </w:pPr>
+    <w:rPr>
+      <w:rFonts w:asciiTheme="majorHAnsi" w:cstheme="majorBidi" w:eastAsiaTheme="majorEastAsia" w:hAnsiTheme="majorHAnsi"/>
+      <w:sz w:val="56"/>
+      <w:szCs w:val="56"/>
+    </w:rPr>
+  </w:style>
+  <w:style w:customStyle="1" w:styleId="TitleChar" w:type="character">
+    <w:name w:val="Title Char"/>
+    <w:basedOn w:val="DefaultParagraphFont"/>
+    <w:link w:val="Title"/>
+    <w:uiPriority w:val="10"/>
+    <w:rsid w:val="00A10FD9"/>
+    <w:rPr>
+      <w:rFonts w:asciiTheme="majorHAnsi" w:cstheme="majorBidi" w:eastAsiaTheme="majorEastAsia" w:hAnsiTheme="majorHAnsi"/>
+      <w:sz w:val="56"/>
+      <w:szCs w:val="56"/>
+    </w:rPr>
+  </w:style>
+  <w:style w:styleId="Subtitle" w:type="paragraph">
+    <w:name w:val="Subtitle"/>
+    <w:basedOn w:val="Title"/>
+    <w:next w:val="BodyText"/>
+    <w:link w:val="SubtitleChar"/>
+    <w:uiPriority w:val="11"/>
+    <w:qFormat/>
+    <w:rsid w:val="00A10FD9"/>
+    <w:pPr>
+      <w:numPr>
+        <w:ilvl w:val="1"/>
+      </w:numPr>
+    </w:pPr>
+    <w:rPr>
+      <w:spacing w:val="15"/>
+      <w:sz w:val="28"/>
+      <w:szCs w:val="28"/>
+    </w:rPr>
+  </w:style>
+  <w:style w:customStyle="1" w:styleId="SubtitleChar" w:type="character">
+    <w:name w:val="Subtitle Char"/>
+    <w:basedOn w:val="DefaultParagraphFont"/>
+    <w:link w:val="Subtitle"/>
+    <w:uiPriority w:val="11"/>
+    <w:rsid w:val="00A10FD9"/>
+    <w:rPr>
+      <w:rFonts w:cstheme="majorBidi" w:eastAsiaTheme="majorEastAsia"/>
+      <w:color w:themeColor="text1" w:themeTint="A6" w:val="595959"/>
+      <w:spacing w:val="15"/>
+      <w:sz w:val="28"/>
+      <w:szCs w:val="28"/>
+    </w:rPr>
+  </w:style>
+  <w:style w:customStyle="1" w:styleId="Author" w:type="paragraph">
+    <w:name w:val="Author"/>
+    <w:basedOn w:val="Title"/>
+    <w:next w:val="BodyText"/>
+    <w:qFormat/>
+    <w:pPr>
+      <w:keepNext/>
+      <w:keepLines/>
+    </w:pPr>
+    <w:rPr>
+      <w:sz w:val="24"/>
+      <w:szCs w:val="24"/>
+    </w:rPr>
+  </w:style>
+  <w:style w:styleId="Date" w:type="paragraph">
+    <w:name w:val="Date"/>
+    <w:basedOn w:val="Title"/>
+    <w:next w:val="BodyText"/>
+    <w:qFormat/>
+    <w:pPr>
+      <w:keepNext/>
+      <w:keepLines/>
+    </w:pPr>
+    <w:rPr>
+      <w:sz w:val="24"/>
+      <w:szCs w:val="24"/>
+    </w:rPr>
+  </w:style>
+  <w:style w:customStyle="1" w:styleId="AbstractTitle" w:type="paragraph">
+    <w:name w:val="Abstract Title"/>
+    <w:basedOn w:val="Normal"/>
+    <w:next w:val="Abstract"/>
+    <w:qFormat/>
+    <w:pPr>
+      <w:keepNext/>
+      <w:keepLines/>
+      <w:spacing w:after="0" w:before="300"/>
+      <w:jc w:val="center"/>
+    </w:pPr>
+    <w:rPr>
+      <w:b/>
+      <w:sz w:val="20"/>
+      <w:szCs w:val="20"/>
+    </w:rPr>
+  </w:style>
+  <w:style w:customStyle="1" w:styleId="Abstract" w:type="paragraph">
+    <w:name w:val="Abstract"/>
+    <w:basedOn w:val="Normal"/>
+    <w:next w:val="BodyText"/>
+    <w:qFormat/>
+    <w:pPr>
+      <w:keepNext/>
+      <w:keepLines/>
+      <w:spacing w:after="300" w:before="100"/>
+    </w:pPr>
+    <w:rPr>
+      <w:sz w:val="20"/>
+      <w:szCs w:val="20"/>
+    </w:rPr>
+  </w:style>
+  <w:style w:styleId="Bibliography" w:type="paragraph">
+    <w:name w:val="Bibliography"/>
+    <w:basedOn w:val="Normal"/>
+    <w:qFormat/>
+  </w:style>
   <w:style w:customStyle="1" w:styleId="Heading1Char" w:type="character">
     <w:name w:val="Heading 1 Char"/>
     <w:basedOn w:val="DefaultParagraphFont"/>
@@ -1254,18 +2485,17 @@
     <w:qFormat/>
     <w:pPr>
       <w:spacing w:after="100" w:before="100"/>
-      <w:ind w:firstLine="0" w:left="480" w:right="480"/>
+      <w:ind w:left="480" w:right="480"/>
     </w:pPr>
   </w:style>
   <w:style w:styleId="FootnoteText" w:type="paragraph">
-    <w:name w:val="Footnote Text"/>
+    <w:name w:val="footnote text"/>
     <w:basedOn w:val="Normal"/>
-    <w:next w:val="FootnoteText"/>
     <w:uiPriority w:val="9"/>
     <w:unhideWhenUsed/>
     <w:qFormat/>
   </w:style>
-  <w:style w:styleId="FootnoteBlockText" w:type="paragraph">
+  <w:style w:customStyle="1" w:styleId="FootnoteBlockText" w:type="paragraph">
     <w:name w:val="Footnote Block Text"/>
     <w:basedOn w:val="FootnoteText"/>
     <w:next w:val="FootnoteText"/>
@@ -1274,17 +2504,11 @@
     <w:qFormat/>
     <w:pPr>
       <w:spacing w:after="100" w:before="100"/>
-      <w:ind w:firstLine="0" w:left="480" w:right="480"/>
+      <w:ind w:left="480" w:right="480"/>
     </w:pPr>
   </w:style>
-  <w:style w:default="1" w:styleId="DefaultParagraphFont" w:type="character">
-    <w:name w:val="Default Paragraph Font"/>
-    <w:semiHidden/>
-    <w:unhideWhenUsed/>
-  </w:style>
-  <w:style w:default="1" w:styleId="Table" w:type="table">
+  <w:style w:customStyle="1" w:styleId="Table" w:type="table">
     <w:name w:val="Table"/>
-    <w:basedOn w:val="TableNormal"/>
     <w:semiHidden/>
     <w:unhideWhenUsed/>
     <w:qFormat/>
@@ -1300,14 +2524,13 @@
     <w:tblStylePr w:type="firstRow">
       <w:tblPr>
         <w:jc w:val="left"/>
-        <w:tblInd w:type="dxa" w:w="0"/>
       </w:tblPr>
       <w:trPr>
         <w:jc w:val="left"/>
       </w:trPr>
       <w:tcPr>
         <w:tcBorders>
-          <w:bottom w:val="single"/>
+          <w:bottom w:color="auto" w:space="0" w:sz="0" w:val="single"/>
         </w:tcBorders>
         <w:vAlign w:val="bottom"/>
       </w:tcPr>
@@ -1331,11 +2554,11 @@
     <w:basedOn w:val="Normal"/>
   </w:style>
   <w:style w:styleId="Caption" w:type="paragraph">
-    <w:name w:val="Caption"/>
+    <w:name w:val="caption"/>
     <w:basedOn w:val="Normal"/>
-    <w:link w:val="BodyTextChar"/>
+    <w:link w:val="CaptionChar"/>
     <w:pPr>
-      <w:spacing w:after="120" w:before="0"/>
+      <w:spacing w:after="120"/>
     </w:pPr>
     <w:rPr>
       <w:i/>
@@ -1363,14 +2586,14 @@
       <w:keepNext/>
     </w:pPr>
   </w:style>
-  <w:style w:customStyle="1" w:styleId="BodyTextChar" w:type="character">
-    <w:name w:val="Body Text Char"/>
+  <w:style w:customStyle="1" w:styleId="CaptionChar" w:type="character">
+    <w:name w:val="Caption Char"/>
     <w:basedOn w:val="DefaultParagraphFont"/>
-    <w:link w:val="BodyText"/>
+    <w:link w:val="Caption"/>
   </w:style>
   <w:style w:customStyle="1" w:styleId="VerbatimChar" w:type="character">
     <w:name w:val="Verbatim Char"/>
-    <w:basedOn w:val="BodyTextChar"/>
+    <w:basedOn w:val="CaptionChar"/>
     <w:rPr>
       <w:rFonts w:ascii="Consolas" w:hAnsi="Consolas"/>
       <w:sz w:val="22"/>
@@ -1378,20 +2601,20 @@
   </w:style>
   <w:style w:customStyle="1" w:styleId="SectionNumber" w:type="character">
     <w:name w:val="Section Number"/>
-    <w:basedOn w:val="BodyTextChar"/>
+    <w:basedOn w:val="CaptionChar"/>
   </w:style>
   <w:style w:styleId="FootnoteReference" w:type="character">
-    <w:name w:val="Footnote Reference"/>
-    <w:basedOn w:val="BodyTextChar"/>
+    <w:name w:val="footnote reference"/>
+    <w:basedOn w:val="CaptionChar"/>
     <w:rPr>
       <w:vertAlign w:val="superscript"/>
     </w:rPr>
   </w:style>
   <w:style w:styleId="Hyperlink" w:type="character">
     <w:name w:val="Hyperlink"/>
-    <w:basedOn w:val="BodyTextChar"/>
-    <w:rPr>
-      <w:color w:themeColor="accent1" w:val="4F81BD"/>
+    <w:basedOn w:val="CaptionChar"/>
+    <w:rPr>
+      <w:color w:themeColor="accent1" w:val="156082"/>
     </w:rPr>
   </w:style>
   <w:style w:styleId="TOCHeading" w:type="paragraph">
@@ -1405,12 +2628,46 @@
       <w:spacing w:before="240" w:line="259" w:lineRule="auto"/>
       <w:outlineLvl w:val="9"/>
     </w:pPr>
-    <w:rPr>
-      <w:rFonts w:asciiTheme="majorHAnsi" w:cstheme="majorBidi" w:eastAsiaTheme="majorEastAsia" w:hAnsiTheme="majorHAnsi"/>
-      <w:b w:val="0"/>
-      <w:bCs w:val="0"/>
-      <w:color w:themeColor="accent1" w:themeShade="BF" w:val="365F91"/>
-    </w:rPr>
+  </w:style>
+  <w:style w:styleId="Header" w:type="paragraph">
+    <w:name w:val="header"/>
+    <w:basedOn w:val="Normal"/>
+    <w:link w:val="HeaderChar"/>
+    <w:rsid w:val="00497B28"/>
+    <w:pPr>
+      <w:tabs>
+        <w:tab w:pos="4680" w:val="center"/>
+        <w:tab w:pos="9360" w:val="right"/>
+      </w:tabs>
+      <w:spacing w:after="0"/>
+    </w:pPr>
+  </w:style>
+  <w:style w:customStyle="1" w:styleId="HeaderChar" w:type="character">
+    <w:name w:val="Header Char"/>
+    <w:basedOn w:val="DefaultParagraphFont"/>
+    <w:link w:val="Header"/>
+    <w:rsid w:val="00497B28"/>
+  </w:style>
+  <w:style w:styleId="Footer" w:type="paragraph">
+    <w:name w:val="footer"/>
+    <w:basedOn w:val="Normal"/>
+    <w:link w:val="FooterChar"/>
+    <w:uiPriority w:val="99"/>
+    <w:rsid w:val="00497B28"/>
+    <w:pPr>
+      <w:tabs>
+        <w:tab w:pos="4680" w:val="center"/>
+        <w:tab w:pos="9360" w:val="right"/>
+      </w:tabs>
+      <w:spacing w:after="0"/>
+    </w:pPr>
+  </w:style>
+  <w:style w:customStyle="1" w:styleId="FooterChar" w:type="character">
+    <w:name w:val="Footer Char"/>
+    <w:basedOn w:val="DefaultParagraphFont"/>
+    <w:link w:val="Footer"/>
+    <w:uiPriority w:val="99"/>
+    <w:rsid w:val="00497B28"/>
   </w:style>
   <w:style w:type="paragraph" w:customStyle="1" w:styleId="SourceCode">
     <w:name w:val="Source Code"/>

</xml_diff>

<commit_message>
Updated for 2/17 assessment
</commit_message>
<xml_diff>
--- a/delta_hydro.docx
+++ b/delta_hydro.docx
@@ -26,7 +26,7 @@
           <w:i/>
           <w:iCs/>
         </w:rPr>
-        <w:t xml:space="preserve">January 29, 2026</w:t>
+        <w:t xml:space="preserve">February 17, 2026</w:t>
       </w:r>
     </w:p>
     <w:bookmarkStart w:id="20" w:name="operational-and-regulatory-conditions"/>
@@ -43,7 +43,7 @@
         <w:pStyle w:val="FirstParagraph"/>
       </w:pPr>
       <w:r>
-        <w:t xml:space="preserve">Entrainment management is the current controlling factor. See most recent weekly outlook for more information.</w:t>
+        <w:t xml:space="preserve">The current controlling factor is Delta Outflow X2. See most recent weekly outlook for more information.</w:t>
       </w:r>
     </w:p>
     <w:bookmarkEnd w:id="20"/>
@@ -61,7 +61,7 @@
         <w:pStyle w:val="FirstParagraph"/>
       </w:pPr>
       <w:r>
-        <w:t xml:space="preserve">Most recent inflow at Freeport in the Sacramento River and Vernalis in the San Joaquin River is 25,094 and 1,996 cfs respectively. Most recent 1-day, 5-day, and 14-day OMRI measurements were -4,945, -4,894, and -5,061 respectively, and most recent export data were 3,551 for Jones Pumping Plant and 1,734 for Henry O. Banks Pumping Plant.</w:t>
+        <w:t xml:space="preserve">Most recent inflow at Freeport in the Sacramento River and Vernalis in the San Joaquin River is 31,197 and 2,851 cfs respectively. Most recent 1-day, 5-day, and 14-day OMRI measurements were -4,989, -4,205, and -5,061 cfs respectively, and most recent export data were 3,551 cfs for Jones Pumping Plant and 1,734 cfs for Henry O. Banks Pumping Plant.</w:t>
       </w:r>
     </w:p>
     <w:tbl>
@@ -189,7 +189,6 @@
                 <w:trHeight w:val="360" w:hRule="auto"/>
                 <w:tblHeader/>
               </w:trPr>
-              header1
               <w:tc>
                 <w:tcPr>
                   <w:tcBorders>
@@ -519,7 +518,6 @@
               <w:trPr>
                 <w:trHeight w:val="360" w:hRule="auto"/>
               </w:trPr>
-              body1
               <w:tc>
                 <w:tcPr>
                   <w:tcBorders>
@@ -849,7 +847,6 @@
               <w:trPr>
                 <w:trHeight w:val="360" w:hRule="auto"/>
               </w:trPr>
-              body2
               <w:tc>
                 <w:tcPr>
                   <w:tcBorders>
@@ -1249,7 +1246,7 @@
         <w:t xml:space="preserve"> </w:t>
       </w:r>
       <w:r>
-        <w:t xml:space="preserve">‘medmed’</w:t>
+        <w:t xml:space="preserve">‘hihi’</w:t>
       </w:r>
       <w:r>
         <w:t xml:space="preserve"> </w:t>
@@ -1281,13 +1278,13 @@
         <w:t xml:space="preserve"> </w:t>
       </w:r>
       <w:r>
-        <w:t xml:space="preserve">“medmed”</w:t>
+        <w:t xml:space="preserve">“hihi”</w:t>
       </w:r>
       <w:r>
         <w:t xml:space="preserve"> </w:t>
       </w:r>
       <w:r>
-        <w:t xml:space="preserve">hydrology is 26, 49, 101 and 163 kilometeres (km) across OMR bins of -2000, -3500, -5000 and &lt;-5500 respectively.</w:t>
+        <w:t xml:space="preserve">hydrology is 99, 100, 119 and 114 kilometers (km) across OMR bins of -2000, -3500, -5000 and &lt;-5500 respectively.</w:t>
       </w:r>
     </w:p>
     <w:p>
@@ -1295,7 +1292,7 @@
         <w:pStyle w:val="BodyText"/>
       </w:pPr>
       <w:r>
-        <w:t xml:space="preserve">Change in altered channel length between OMR levels is 88 km for current conditions and 137 km for forecasted conditions indicating that ZOI impacts across OMR scenarios would increase between current and forecasted conditions. Across the nine hydrology bins, changes in altered channel length across OMR scenarios are moderate (between 25th and 75th percentiles) and high (&gt;75th percentile) respectively for current and forecasted hydrology.</w:t>
+        <w:t xml:space="preserve">Change in altered channel length between OMR levels is 88 km for current conditions and 15 km for forecasted conditions indicating that ZOI impacts across OMR scenarios would decrease between current and forecasted conditions. Across the nine hydrology bins, changes in altered channel length across OMR scenarios are moderate (between 25th and 75th percentiles) and low (&lt;25th percentile) respectively for current and forecasted hydrology.</w:t>
       </w:r>
     </w:p>
     <w:tbl>

</xml_diff>